<commit_message>
docs(final): update contribution evidence and review
</commit_message>
<xml_diff>
--- a/final-exam/final-exam-group-answer.docx
+++ b/final-exam/final-exam-group-answer.docx
@@ -1,6 +1,6 @@
 
 <file path=word/document.xml><?xml version="1.0" encoding="utf-8"?>
-<w:document xmlns:wpc="http://schemas.microsoft.com/office/word/2010/wordprocessingCanvas" xmlns:cx="http://schemas.microsoft.com/office/drawing/2014/chartex" xmlns:cx1="http://schemas.microsoft.com/office/drawing/2015/9/8/chartex" xmlns:cx2="http://schemas.microsoft.com/office/drawing/2015/10/21/chartex" xmlns:cx3="http://schemas.microsoft.com/office/drawing/2016/5/9/chartex" xmlns:cx4="http://schemas.microsoft.com/office/drawing/2016/5/10/chartex" xmlns:cx5="http://schemas.microsoft.com/office/drawing/2016/5/11/chartex" xmlns:cx6="http://schemas.microsoft.com/office/drawing/2016/5/12/chartex" xmlns:cx7="http://schemas.microsoft.com/office/drawing/2016/5/13/chartex" xmlns:cx8="http://schemas.microsoft.com/office/drawing/2016/5/14/chartex" xmlns:mc="http://schemas.openxmlformats.org/markup-compatibility/2006" xmlns:aink="http://schemas.microsoft.com/office/drawing/2016/ink" xmlns:am3d="http://schemas.microsoft.com/office/drawing/2017/model3d" xmlns:o="urn:schemas-microsoft-com:office:office" xmlns:oel="http://schemas.microsoft.com/office/2019/extlst" xmlns:r="http://schemas.openxmlformats.org/officeDocument/2006/relationships" xmlns:m="http://schemas.openxmlformats.org/officeDocument/2006/math" xmlns:v="urn:schemas-microsoft-com:vml" xmlns:wp14="http://schemas.microsoft.com/office/word/2010/wordprocessingDrawing" xmlns:wp="http://schemas.openxmlformats.org/drawingml/2006/wordprocessingDrawing" xmlns:w10="urn:schemas-microsoft-com:office:word" xmlns:w="http://schemas.openxmlformats.org/wordprocessingml/2006/main" xmlns:w14="http://schemas.microsoft.com/office/word/2010/wordml" xmlns:w15="http://schemas.microsoft.com/office/word/2012/wordml" xmlns:w16cex="http://schemas.microsoft.com/office/word/2018/wordml/cex" xmlns:w16cid="http://schemas.microsoft.com/office/word/2016/wordml/cid" xmlns:w16="http://schemas.microsoft.com/office/word/2018/wordml" xmlns:w16du="http://schemas.microsoft.com/office/word/2023/wordml/word16du" xmlns:w16sdtdh="http://schemas.microsoft.com/office/word/2020/wordml/sdtdatahash" xmlns:w16sdtfl="http://schemas.microsoft.com/office/word/2024/wordml/sdtformatlock" xmlns:w16se="http://schemas.microsoft.com/office/word/2015/wordml/symex" xmlns:wpg="http://schemas.microsoft.com/office/word/2010/wordprocessingGroup" xmlns:wpi="http://schemas.microsoft.com/office/word/2010/wordprocessingInk" xmlns:wne="http://schemas.microsoft.com/office/word/2006/wordml" xmlns:wps="http://schemas.microsoft.com/office/word/2010/wordprocessingShape" mc:Ignorable="w14 w15 w16se w16cid w16 w16cex w16sdtdh w16sdtfl w16du wp14">
+<w:document xmlns:wpc="http://schemas.microsoft.com/office/word/2010/wordprocessingCanvas" xmlns:cx="http://schemas.microsoft.com/office/drawing/2014/chartex" xmlns:cx1="http://schemas.microsoft.com/office/drawing/2015/9/8/chartex" xmlns:cx2="http://schemas.microsoft.com/office/drawing/2015/10/21/chartex" xmlns:cx3="http://schemas.microsoft.com/office/drawing/2016/5/9/chartex" xmlns:cx4="http://schemas.microsoft.com/office/drawing/2016/5/10/chartex" xmlns:cx5="http://schemas.microsoft.com/office/drawing/2016/5/11/chartex" xmlns:cx6="http://schemas.microsoft.com/office/drawing/2016/5/12/chartex" xmlns:cx7="http://schemas.microsoft.com/office/drawing/2016/5/13/chartex" xmlns:cx8="http://schemas.microsoft.com/office/drawing/2016/5/14/chartex" xmlns:mc="http://schemas.openxmlformats.org/markup-compatibility/2006" xmlns:aink="http://schemas.microsoft.com/office/drawing/2016/ink" xmlns:am3d="http://schemas.microsoft.com/office/drawing/2017/model3d" xmlns:o="urn:schemas-microsoft-com:office:office" xmlns:r="http://schemas.openxmlformats.org/officeDocument/2006/relationships" xmlns:m="http://schemas.openxmlformats.org/officeDocument/2006/math" xmlns:v="urn:schemas-microsoft-com:vml" xmlns:wp14="http://schemas.microsoft.com/office/word/2010/wordprocessingDrawing" xmlns:wp="http://schemas.openxmlformats.org/drawingml/2006/wordprocessingDrawing" xmlns:w10="urn:schemas-microsoft-com:office:word" xmlns:w="http://schemas.openxmlformats.org/wordprocessingml/2006/main" xmlns:w14="http://schemas.microsoft.com/office/word/2010/wordml" xmlns:w15="http://schemas.microsoft.com/office/word/2012/wordml" xmlns:w16cex="http://schemas.microsoft.com/office/word/2018/wordml/cex" xmlns:w16cid="http://schemas.microsoft.com/office/word/2016/wordml/cid" xmlns:w16="http://schemas.microsoft.com/office/word/2018/wordml" xmlns:w16sdtdh="http://schemas.microsoft.com/office/word/2020/wordml/sdtdatahash" xmlns:w16se="http://schemas.microsoft.com/office/word/2015/wordml/symex" xmlns:wpg="http://schemas.microsoft.com/office/word/2010/wordprocessingGroup" xmlns:wpi="http://schemas.microsoft.com/office/word/2010/wordprocessingInk" xmlns:wne="http://schemas.microsoft.com/office/word/2006/wordml" xmlns:wps="http://schemas.microsoft.com/office/word/2010/wordprocessingShape" mc:Ignorable="w14 w15 w16se w16cid w16 w16cex w16sdtdh wp14">
   <w:body>
     <w:p>
       <w:pPr>
@@ -933,7 +933,6 @@
               <w:t>ใช้งานหน้างาน</w:t>
             </w:r>
             <w:proofErr w:type="spellEnd"/>
-            <w:proofErr w:type="gramStart"/>
             <w:r>
               <w:rPr>
                 <w:rFonts w:ascii="TH SarabunPSK" w:hAnsi="TH SarabunPSK" w:cs="TH SarabunPSK" w:hint="cs"/>
@@ -943,7 +942,6 @@
               </w:rPr>
               <w:t xml:space="preserve">   (</w:t>
             </w:r>
-            <w:proofErr w:type="gramEnd"/>
             <w:r>
               <w:rPr>
                 <w:rFonts w:ascii="TH SarabunPSK" w:hAnsi="TH SarabunPSK" w:cs="TH SarabunPSK" w:hint="cs"/>
@@ -6922,7 +6920,7 @@
             <w:pPr>
               <w:keepNext/>
               <w:rPr>
-                <w:rFonts w:ascii="TH SarabunPSK" w:hAnsi="TH SarabunPSK" w:cs="TH SarabunPSK" w:hint="cs"/>
+                <w:rFonts w:ascii="TH SarabunPSK" w:hAnsi="TH SarabunPSK" w:cs="TH SarabunPSK"/>
                 <w:sz w:val="28"/>
                 <w:szCs w:val="28"/>
               </w:rPr>
@@ -6959,7 +6957,7 @@
             <w:pPr>
               <w:keepNext/>
               <w:rPr>
-                <w:rFonts w:ascii="TH SarabunPSK" w:hAnsi="TH SarabunPSK" w:cs="TH SarabunPSK" w:hint="cs"/>
+                <w:rFonts w:ascii="TH SarabunPSK" w:hAnsi="TH SarabunPSK" w:cs="TH SarabunPSK"/>
                 <w:sz w:val="28"/>
                 <w:szCs w:val="28"/>
               </w:rPr>
@@ -7033,7 +7031,7 @@
             <w:pPr>
               <w:keepNext/>
               <w:rPr>
-                <w:rFonts w:ascii="TH SarabunPSK" w:hAnsi="TH SarabunPSK" w:cs="TH SarabunPSK" w:hint="cs"/>
+                <w:rFonts w:ascii="TH SarabunPSK" w:hAnsi="TH SarabunPSK" w:cs="TH SarabunPSK"/>
                 <w:sz w:val="28"/>
                 <w:szCs w:val="28"/>
               </w:rPr>
@@ -7070,7 +7068,7 @@
             <w:pPr>
               <w:keepNext/>
               <w:rPr>
-                <w:rFonts w:ascii="TH SarabunPSK" w:hAnsi="TH SarabunPSK" w:cs="TH SarabunPSK" w:hint="cs"/>
+                <w:rFonts w:ascii="TH SarabunPSK" w:hAnsi="TH SarabunPSK" w:cs="TH SarabunPSK"/>
                 <w:sz w:val="28"/>
                 <w:szCs w:val="28"/>
               </w:rPr>
@@ -7160,7 +7158,7 @@
             <w:pPr>
               <w:keepNext/>
               <w:rPr>
-                <w:rFonts w:ascii="TH SarabunPSK" w:hAnsi="TH SarabunPSK" w:cs="TH SarabunPSK" w:hint="cs"/>
+                <w:rFonts w:ascii="TH SarabunPSK" w:hAnsi="TH SarabunPSK" w:cs="TH SarabunPSK"/>
                 <w:sz w:val="28"/>
                 <w:szCs w:val="28"/>
               </w:rPr>
@@ -7197,7 +7195,7 @@
             <w:pPr>
               <w:keepNext/>
               <w:rPr>
-                <w:rFonts w:ascii="TH SarabunPSK" w:hAnsi="TH SarabunPSK" w:cs="TH SarabunPSK" w:hint="cs"/>
+                <w:rFonts w:ascii="TH SarabunPSK" w:hAnsi="TH SarabunPSK" w:cs="TH SarabunPSK"/>
                 <w:sz w:val="28"/>
                 <w:szCs w:val="28"/>
               </w:rPr>
@@ -7271,7 +7269,7 @@
             <w:pPr>
               <w:keepNext/>
               <w:rPr>
-                <w:rFonts w:ascii="TH SarabunPSK" w:hAnsi="TH SarabunPSK" w:cs="TH SarabunPSK" w:hint="cs"/>
+                <w:rFonts w:ascii="TH SarabunPSK" w:hAnsi="TH SarabunPSK" w:cs="TH SarabunPSK"/>
                 <w:sz w:val="28"/>
                 <w:szCs w:val="28"/>
               </w:rPr>
@@ -7308,7 +7306,7 @@
             <w:pPr>
               <w:keepNext/>
               <w:rPr>
-                <w:rFonts w:ascii="TH SarabunPSK" w:hAnsi="TH SarabunPSK" w:cs="TH SarabunPSK" w:hint="cs"/>
+                <w:rFonts w:ascii="TH SarabunPSK" w:hAnsi="TH SarabunPSK" w:cs="TH SarabunPSK"/>
                 <w:sz w:val="28"/>
                 <w:szCs w:val="28"/>
               </w:rPr>
@@ -7399,7 +7397,7 @@
             <w:pPr>
               <w:keepNext/>
               <w:rPr>
-                <w:rFonts w:ascii="TH SarabunPSK" w:hAnsi="TH SarabunPSK" w:cs="TH SarabunPSK" w:hint="cs"/>
+                <w:rFonts w:ascii="TH SarabunPSK" w:hAnsi="TH SarabunPSK" w:cs="TH SarabunPSK"/>
                 <w:sz w:val="28"/>
                 <w:szCs w:val="28"/>
               </w:rPr>
@@ -7436,7 +7434,7 @@
             <w:pPr>
               <w:keepNext/>
               <w:rPr>
-                <w:rFonts w:ascii="TH SarabunPSK" w:hAnsi="TH SarabunPSK" w:cs="TH SarabunPSK" w:hint="cs"/>
+                <w:rFonts w:ascii="TH SarabunPSK" w:hAnsi="TH SarabunPSK" w:cs="TH SarabunPSK"/>
                 <w:sz w:val="28"/>
                 <w:szCs w:val="28"/>
               </w:rPr>
@@ -7474,7 +7472,7 @@
     <w:p>
       <w:pPr>
         <w:rPr>
-          <w:rFonts w:ascii="TH SarabunPSK" w:hAnsi="TH SarabunPSK" w:cs="TH SarabunPSK" w:hint="cs"/>
+          <w:rFonts w:ascii="TH SarabunPSK" w:hAnsi="TH SarabunPSK" w:cs="TH SarabunPSK"/>
         </w:rPr>
       </w:pPr>
       <w:r>
@@ -10576,7 +10574,7 @@
             <w:pPr>
               <w:keepNext/>
               <w:rPr>
-                <w:rFonts w:ascii="TH SarabunPSK" w:hAnsi="TH SarabunPSK" w:cs="TH SarabunPSK" w:hint="cs"/>
+                <w:rFonts w:ascii="TH SarabunPSK" w:hAnsi="TH SarabunPSK" w:cs="TH SarabunPSK"/>
                 <w:sz w:val="28"/>
                 <w:szCs w:val="28"/>
               </w:rPr>
@@ -10613,7 +10611,7 @@
             <w:pPr>
               <w:keepNext/>
               <w:rPr>
-                <w:rFonts w:ascii="TH SarabunPSK" w:hAnsi="TH SarabunPSK" w:cs="TH SarabunPSK" w:hint="cs"/>
+                <w:rFonts w:ascii="TH SarabunPSK" w:hAnsi="TH SarabunPSK" w:cs="TH SarabunPSK"/>
                 <w:sz w:val="28"/>
                 <w:szCs w:val="28"/>
               </w:rPr>
@@ -10659,7 +10657,7 @@
             <w:pPr>
               <w:keepNext/>
               <w:rPr>
-                <w:rFonts w:ascii="TH SarabunPSK" w:hAnsi="TH SarabunPSK" w:cs="TH SarabunPSK" w:hint="cs"/>
+                <w:rFonts w:ascii="TH SarabunPSK" w:hAnsi="TH SarabunPSK" w:cs="TH SarabunPSK"/>
                 <w:sz w:val="28"/>
                 <w:szCs w:val="28"/>
               </w:rPr>
@@ -10696,7 +10694,7 @@
             <w:pPr>
               <w:keepNext/>
               <w:rPr>
-                <w:rFonts w:ascii="TH SarabunPSK" w:hAnsi="TH SarabunPSK" w:cs="TH SarabunPSK" w:hint="cs"/>
+                <w:rFonts w:ascii="TH SarabunPSK" w:hAnsi="TH SarabunPSK" w:cs="TH SarabunPSK"/>
                 <w:sz w:val="28"/>
                 <w:szCs w:val="28"/>
               </w:rPr>
@@ -10733,7 +10731,7 @@
             <w:pPr>
               <w:keepNext/>
               <w:rPr>
-                <w:rFonts w:ascii="TH SarabunPSK" w:hAnsi="TH SarabunPSK" w:cs="TH SarabunPSK" w:hint="cs"/>
+                <w:rFonts w:ascii="TH SarabunPSK" w:hAnsi="TH SarabunPSK" w:cs="TH SarabunPSK"/>
                 <w:sz w:val="28"/>
                 <w:szCs w:val="28"/>
               </w:rPr>
@@ -10777,7 +10775,7 @@
             <w:pPr>
               <w:keepNext/>
               <w:rPr>
-                <w:rFonts w:ascii="TH SarabunPSK" w:hAnsi="TH SarabunPSK" w:cs="TH SarabunPSK" w:hint="cs"/>
+                <w:rFonts w:ascii="TH SarabunPSK" w:hAnsi="TH SarabunPSK" w:cs="TH SarabunPSK"/>
                 <w:sz w:val="28"/>
                 <w:szCs w:val="28"/>
               </w:rPr>
@@ -10814,7 +10812,7 @@
             <w:pPr>
               <w:keepNext/>
               <w:rPr>
-                <w:rFonts w:ascii="TH SarabunPSK" w:hAnsi="TH SarabunPSK" w:cs="TH SarabunPSK" w:hint="cs"/>
+                <w:rFonts w:ascii="TH SarabunPSK" w:hAnsi="TH SarabunPSK" w:cs="TH SarabunPSK"/>
                 <w:sz w:val="28"/>
                 <w:szCs w:val="28"/>
               </w:rPr>
@@ -10860,7 +10858,7 @@
             <w:pPr>
               <w:keepNext/>
               <w:rPr>
-                <w:rFonts w:ascii="TH SarabunPSK" w:hAnsi="TH SarabunPSK" w:cs="TH SarabunPSK" w:hint="cs"/>
+                <w:rFonts w:ascii="TH SarabunPSK" w:hAnsi="TH SarabunPSK" w:cs="TH SarabunPSK"/>
                 <w:sz w:val="28"/>
                 <w:szCs w:val="28"/>
               </w:rPr>
@@ -10897,7 +10895,7 @@
             <w:pPr>
               <w:keepNext/>
               <w:rPr>
-                <w:rFonts w:ascii="TH SarabunPSK" w:hAnsi="TH SarabunPSK" w:cs="TH SarabunPSK" w:hint="cs"/>
+                <w:rFonts w:ascii="TH SarabunPSK" w:hAnsi="TH SarabunPSK" w:cs="TH SarabunPSK"/>
                 <w:sz w:val="28"/>
                 <w:szCs w:val="28"/>
               </w:rPr>
@@ -10934,7 +10932,7 @@
             <w:pPr>
               <w:keepNext/>
               <w:rPr>
-                <w:rFonts w:ascii="TH SarabunPSK" w:hAnsi="TH SarabunPSK" w:cs="TH SarabunPSK" w:hint="cs"/>
+                <w:rFonts w:ascii="TH SarabunPSK" w:hAnsi="TH SarabunPSK" w:cs="TH SarabunPSK"/>
                 <w:sz w:val="28"/>
                 <w:szCs w:val="28"/>
               </w:rPr>
@@ -10977,7 +10975,7 @@
           <w:p>
             <w:pPr>
               <w:rPr>
-                <w:rFonts w:ascii="TH SarabunPSK" w:hAnsi="TH SarabunPSK" w:cs="TH SarabunPSK" w:hint="cs"/>
+                <w:rFonts w:ascii="TH SarabunPSK" w:hAnsi="TH SarabunPSK" w:cs="TH SarabunPSK"/>
                 <w:sz w:val="28"/>
                 <w:szCs w:val="28"/>
               </w:rPr>
@@ -11013,7 +11011,7 @@
           <w:p>
             <w:pPr>
               <w:rPr>
-                <w:rFonts w:ascii="TH SarabunPSK" w:hAnsi="TH SarabunPSK" w:cs="TH SarabunPSK" w:hint="cs"/>
+                <w:rFonts w:ascii="TH SarabunPSK" w:hAnsi="TH SarabunPSK" w:cs="TH SarabunPSK"/>
                 <w:sz w:val="28"/>
                 <w:szCs w:val="28"/>
               </w:rPr>
@@ -11075,7 +11073,7 @@
           <w:p>
             <w:pPr>
               <w:rPr>
-                <w:rFonts w:ascii="TH SarabunPSK" w:hAnsi="TH SarabunPSK" w:cs="TH SarabunPSK" w:hint="cs"/>
+                <w:rFonts w:ascii="TH SarabunPSK" w:hAnsi="TH SarabunPSK" w:cs="TH SarabunPSK"/>
                 <w:sz w:val="28"/>
                 <w:szCs w:val="28"/>
               </w:rPr>
@@ -11111,7 +11109,7 @@
           <w:p>
             <w:pPr>
               <w:rPr>
-                <w:rFonts w:ascii="TH SarabunPSK" w:hAnsi="TH SarabunPSK" w:cs="TH SarabunPSK" w:hint="cs"/>
+                <w:rFonts w:ascii="TH SarabunPSK" w:hAnsi="TH SarabunPSK" w:cs="TH SarabunPSK"/>
                 <w:sz w:val="28"/>
                 <w:szCs w:val="28"/>
               </w:rPr>
@@ -11147,7 +11145,7 @@
           <w:p>
             <w:pPr>
               <w:rPr>
-                <w:rFonts w:ascii="TH SarabunPSK" w:hAnsi="TH SarabunPSK" w:cs="TH SarabunPSK" w:hint="cs"/>
+                <w:rFonts w:ascii="TH SarabunPSK" w:hAnsi="TH SarabunPSK" w:cs="TH SarabunPSK"/>
                 <w:sz w:val="28"/>
                 <w:szCs w:val="28"/>
               </w:rPr>
@@ -11198,7 +11196,7 @@
           <w:p>
             <w:pPr>
               <w:rPr>
-                <w:rFonts w:ascii="TH SarabunPSK" w:hAnsi="TH SarabunPSK" w:cs="TH SarabunPSK" w:hint="cs"/>
+                <w:rFonts w:ascii="TH SarabunPSK" w:hAnsi="TH SarabunPSK" w:cs="TH SarabunPSK"/>
                 <w:color w:val="5A6B7C"/>
                 <w:sz w:val="28"/>
                 <w:szCs w:val="28"/>
@@ -11235,7 +11233,7 @@
           <w:p>
             <w:pPr>
               <w:rPr>
-                <w:rFonts w:ascii="TH SarabunPSK" w:hAnsi="TH SarabunPSK" w:cs="TH SarabunPSK" w:hint="cs"/>
+                <w:rFonts w:ascii="TH SarabunPSK" w:hAnsi="TH SarabunPSK" w:cs="TH SarabunPSK"/>
                 <w:sz w:val="28"/>
                 <w:szCs w:val="28"/>
               </w:rPr>
@@ -11280,7 +11278,7 @@
           <w:p>
             <w:pPr>
               <w:rPr>
-                <w:rFonts w:ascii="TH SarabunPSK" w:hAnsi="TH SarabunPSK" w:cs="TH SarabunPSK" w:hint="cs"/>
+                <w:rFonts w:ascii="TH SarabunPSK" w:hAnsi="TH SarabunPSK" w:cs="TH SarabunPSK"/>
                 <w:sz w:val="28"/>
                 <w:szCs w:val="28"/>
               </w:rPr>
@@ -11316,7 +11314,7 @@
           <w:p>
             <w:pPr>
               <w:rPr>
-                <w:rFonts w:ascii="TH SarabunPSK" w:hAnsi="TH SarabunPSK" w:cs="TH SarabunPSK" w:hint="cs"/>
+                <w:rFonts w:ascii="TH SarabunPSK" w:hAnsi="TH SarabunPSK" w:cs="TH SarabunPSK"/>
                 <w:sz w:val="28"/>
                 <w:szCs w:val="28"/>
               </w:rPr>
@@ -11352,7 +11350,7 @@
           <w:p>
             <w:pPr>
               <w:rPr>
-                <w:rFonts w:ascii="TH SarabunPSK" w:hAnsi="TH SarabunPSK" w:cs="TH SarabunPSK" w:hint="cs"/>
+                <w:rFonts w:ascii="TH SarabunPSK" w:hAnsi="TH SarabunPSK" w:cs="TH SarabunPSK"/>
                 <w:sz w:val="28"/>
                 <w:szCs w:val="28"/>
               </w:rPr>
@@ -13768,7 +13766,7 @@
             <w:pPr>
               <w:keepNext/>
               <w:rPr>
-                <w:rFonts w:ascii="TH SarabunPSK" w:hAnsi="TH SarabunPSK" w:cs="TH SarabunPSK" w:hint="cs"/>
+                <w:rFonts w:ascii="TH SarabunPSK" w:hAnsi="TH SarabunPSK" w:cs="TH SarabunPSK"/>
                 <w:sz w:val="28"/>
                 <w:szCs w:val="28"/>
               </w:rPr>
@@ -14047,7 +14045,7 @@
             <w:pPr>
               <w:keepNext/>
               <w:rPr>
-                <w:rFonts w:ascii="TH SarabunPSK" w:hAnsi="TH SarabunPSK" w:cs="TH SarabunPSK" w:hint="cs"/>
+                <w:rFonts w:ascii="TH SarabunPSK" w:hAnsi="TH SarabunPSK" w:cs="TH SarabunPSK"/>
                 <w:sz w:val="28"/>
                 <w:szCs w:val="28"/>
               </w:rPr>
@@ -14328,7 +14326,7 @@
           <w:p>
             <w:pPr>
               <w:rPr>
-                <w:rFonts w:ascii="TH SarabunPSK" w:hAnsi="TH SarabunPSK" w:cs="TH SarabunPSK" w:hint="cs"/>
+                <w:rFonts w:ascii="TH SarabunPSK" w:hAnsi="TH SarabunPSK" w:cs="TH SarabunPSK"/>
                 <w:sz w:val="28"/>
                 <w:szCs w:val="28"/>
               </w:rPr>
@@ -14592,7 +14590,7 @@
           <w:p>
             <w:pPr>
               <w:rPr>
-                <w:rFonts w:ascii="TH SarabunPSK" w:hAnsi="TH SarabunPSK" w:cs="TH SarabunPSK" w:hint="cs"/>
+                <w:rFonts w:ascii="TH SarabunPSK" w:hAnsi="TH SarabunPSK" w:cs="TH SarabunPSK"/>
                 <w:sz w:val="28"/>
                 <w:szCs w:val="28"/>
               </w:rPr>
@@ -14864,7 +14862,7 @@
           <w:p>
             <w:pPr>
               <w:rPr>
-                <w:rFonts w:ascii="TH SarabunPSK" w:hAnsi="TH SarabunPSK" w:cs="TH SarabunPSK" w:hint="cs"/>
+                <w:rFonts w:ascii="TH SarabunPSK" w:hAnsi="TH SarabunPSK" w:cs="TH SarabunPSK"/>
                 <w:sz w:val="28"/>
                 <w:szCs w:val="28"/>
               </w:rPr>
@@ -19607,6 +19605,7 @@
               </w:rPr>
               <w:t>การเชื่อมต่อช่องทางแจ้งเตือนภายนอก</w:t>
             </w:r>
+            <w:proofErr w:type="gramEnd"/>
             <w:r>
               <w:rPr>
                 <w:rFonts w:ascii="TH SarabunPSK" w:hAnsi="TH SarabunPSK" w:cs="TH SarabunPSK" w:hint="cs"/>
@@ -19616,19 +19615,7 @@
                 <w:sz w:val="26"/>
                 <w:szCs w:val="26"/>
               </w:rPr>
-              <w:t xml:space="preserve">   [</w:t>
-            </w:r>
-            <w:proofErr w:type="gramEnd"/>
-            <w:r>
-              <w:rPr>
-                <w:rFonts w:ascii="TH SarabunPSK" w:hAnsi="TH SarabunPSK" w:cs="TH SarabunPSK" w:hint="cs"/>
-                <w:b/>
-                <w:bCs/>
-                <w:color w:val="F2C46D"/>
-                <w:sz w:val="26"/>
-                <w:szCs w:val="26"/>
-              </w:rPr>
-              <w:t>Proposed]</w:t>
+              <w:t xml:space="preserve">   [Proposed]</w:t>
             </w:r>
           </w:p>
         </w:tc>
@@ -21273,14 +21260,12 @@
         <w:t>ใช้งานหน้างาน</w:t>
       </w:r>
       <w:proofErr w:type="spellEnd"/>
-      <w:proofErr w:type="gramStart"/>
       <w:r>
         <w:rPr>
           <w:rFonts w:ascii="TH SarabunPSK" w:hAnsi="TH SarabunPSK" w:cs="TH SarabunPSK" w:hint="cs"/>
         </w:rPr>
         <w:t xml:space="preserve">   (</w:t>
       </w:r>
-      <w:proofErr w:type="gramEnd"/>
       <w:r>
         <w:rPr>
           <w:rFonts w:ascii="TH SarabunPSK" w:hAnsi="TH SarabunPSK" w:cs="TH SarabunPSK"/>
@@ -24617,6 +24602,7 @@
         <w:t>ทุกภาพมี</w:t>
       </w:r>
       <w:proofErr w:type="spellEnd"/>
+      <w:proofErr w:type="gramEnd"/>
       <w:r>
         <w:rPr>
           <w:rFonts w:ascii="TH SarabunPSK" w:hAnsi="TH SarabunPSK" w:cs="TH SarabunPSK" w:hint="cs"/>
@@ -24631,7 +24617,6 @@
         <w:t>drawio</w:t>
       </w:r>
       <w:proofErr w:type="spellEnd"/>
-      <w:proofErr w:type="gramEnd"/>
       <w:r>
         <w:rPr>
           <w:rFonts w:ascii="TH SarabunPSK" w:hAnsi="TH SarabunPSK" w:cs="TH SarabunPSK" w:hint="cs"/>
@@ -24873,16 +24858,16 @@
             <w:pPr>
               <w:keepNext/>
               <w:rPr>
-                <w:rFonts w:ascii="TH SarabunPSK" w:hAnsi="TH SarabunPSK" w:cs="TH SarabunPSK" w:hint="cs"/>
-                <w:cs/>
-              </w:rPr>
-            </w:pPr>
-            <w:r>
-              <w:rPr>
-                <w:rFonts w:ascii="TH SarabunPSK" w:hAnsi="TH SarabunPSK" w:cs="TH SarabunPSK" w:hint="cs"/>
-                <w:cs/>
-              </w:rPr>
-              <w:t>ช่วย</w:t>
+                <w:rFonts w:ascii="TH SarabunPSK" w:hAnsi="TH SarabunPSK" w:cs="TH SarabunPSK"/>
+                <w:cs/>
+              </w:rPr>
+            </w:pPr>
+            <w:r>
+              <w:rPr>
+                <w:rFonts w:ascii="TH SarabunPSK" w:hAnsi="TH SarabunPSK" w:cs="TH SarabunPSK" w:hint="cs"/>
+                <w:cs/>
+              </w:rPr>
+              <w:t>ช่วยวิเคระ</w:t>
             </w:r>
             <w:proofErr w:type="spellStart"/>
             <w:r>
@@ -24890,7 +24875,7 @@
                 <w:rFonts w:ascii="TH SarabunPSK" w:hAnsi="TH SarabunPSK" w:cs="TH SarabunPSK" w:hint="cs"/>
                 <w:cs/>
               </w:rPr>
-              <w:t>วิเคระห์</w:t>
+              <w:t>ห์</w:t>
             </w:r>
             <w:proofErr w:type="spellEnd"/>
             <w:r>
@@ -25197,9 +25182,9 @@
         <w:tblLook w:val="04A0" w:firstRow="1" w:lastRow="0" w:firstColumn="1" w:lastColumn="0" w:noHBand="0" w:noVBand="1"/>
       </w:tblPr>
       <w:tblGrid>
-        <w:gridCol w:w="1980"/>
-        <w:gridCol w:w="4284"/>
-        <w:gridCol w:w="3374"/>
+        <w:gridCol w:w="1880"/>
+        <w:gridCol w:w="3633"/>
+        <w:gridCol w:w="4125"/>
       </w:tblGrid>
       <w:tr>
         <w:trPr>
@@ -25493,21 +25478,12 @@
               </w:rPr>
               <w:t>นาย</w:t>
             </w:r>
-            <w:proofErr w:type="spellStart"/>
-            <w:r>
-              <w:rPr>
-                <w:rFonts w:ascii="TH SarabunPSK" w:hAnsi="TH SarabunPSK" w:cs="TH SarabunPSK" w:hint="cs"/>
-                <w:cs/>
-              </w:rPr>
-              <w:t>นร</w:t>
-            </w:r>
-            <w:proofErr w:type="spellEnd"/>
-            <w:r>
-              <w:rPr>
-                <w:rFonts w:ascii="TH SarabunPSK" w:hAnsi="TH SarabunPSK" w:cs="TH SarabunPSK" w:hint="cs"/>
-                <w:cs/>
-              </w:rPr>
-              <w:t xml:space="preserve">บดี บุญเลิศ </w:t>
+            <w:r>
+              <w:rPr>
+                <w:rFonts w:ascii="TH SarabunPSK" w:hAnsi="TH SarabunPSK" w:cs="TH SarabunPSK" w:hint="cs"/>
+                <w:cs/>
+              </w:rPr>
+              <w:t xml:space="preserve">นรบดี บุญเลิศ </w:t>
             </w:r>
             <w:r>
               <w:rPr>
@@ -25601,6 +25577,14 @@
                 <w:rFonts w:ascii="TH SarabunPSK" w:hAnsi="TH SarabunPSK" w:cs="TH SarabunPSK"/>
               </w:rPr>
             </w:pPr>
+            <w:r>
+              <w:rPr>
+                <w:rFonts w:ascii="TH SarabunPSK" w:hAnsi="TH SarabunPSK" w:cs="TH SarabunPSK"/>
+                <w:sz w:val="28"/>
+                <w:szCs w:val="28"/>
+              </w:rPr>
+              <w:t>1bab91875d71f2ae877f37af872de5973ef4aeed</w:t>
+            </w:r>
           </w:p>
         </w:tc>
       </w:tr>
@@ -25676,7 +25660,7 @@
             <w:pPr>
               <w:keepNext/>
               <w:rPr>
-                <w:rFonts w:ascii="TH SarabunPSK" w:hAnsi="TH SarabunPSK" w:cs="TH SarabunPSK" w:hint="cs"/>
+                <w:rFonts w:ascii="TH SarabunPSK" w:hAnsi="TH SarabunPSK" w:cs="TH SarabunPSK"/>
                 <w:cs/>
               </w:rPr>
             </w:pPr>
@@ -25732,6 +25716,14 @@
                 <w:rFonts w:ascii="TH SarabunPSK" w:hAnsi="TH SarabunPSK" w:cs="TH SarabunPSK"/>
               </w:rPr>
             </w:pPr>
+            <w:r>
+              <w:rPr>
+                <w:rFonts w:ascii="TH SarabunPSK" w:hAnsi="TH SarabunPSK" w:cs="TH SarabunPSK"/>
+                <w:sz w:val="28"/>
+                <w:szCs w:val="28"/>
+              </w:rPr>
+              <w:t>61326ee2c6608f709e72ee5c2ccd52bf27ee4f4b</w:t>
+            </w:r>
           </w:p>
         </w:tc>
       </w:tr>
@@ -25849,7 +25841,7 @@
 </file>
 
 <file path=word/endnotes.xml><?xml version="1.0" encoding="utf-8"?>
-<w:endnotes xmlns:wpc="http://schemas.microsoft.com/office/word/2010/wordprocessingCanvas" xmlns:cx="http://schemas.microsoft.com/office/drawing/2014/chartex" xmlns:cx1="http://schemas.microsoft.com/office/drawing/2015/9/8/chartex" xmlns:cx2="http://schemas.microsoft.com/office/drawing/2015/10/21/chartex" xmlns:cx3="http://schemas.microsoft.com/office/drawing/2016/5/9/chartex" xmlns:cx4="http://schemas.microsoft.com/office/drawing/2016/5/10/chartex" xmlns:cx5="http://schemas.microsoft.com/office/drawing/2016/5/11/chartex" xmlns:cx6="http://schemas.microsoft.com/office/drawing/2016/5/12/chartex" xmlns:cx7="http://schemas.microsoft.com/office/drawing/2016/5/13/chartex" xmlns:cx8="http://schemas.microsoft.com/office/drawing/2016/5/14/chartex" xmlns:mc="http://schemas.openxmlformats.org/markup-compatibility/2006" xmlns:aink="http://schemas.microsoft.com/office/drawing/2016/ink" xmlns:am3d="http://schemas.microsoft.com/office/drawing/2017/model3d" xmlns:o="urn:schemas-microsoft-com:office:office" xmlns:oel="http://schemas.microsoft.com/office/2019/extlst" xmlns:r="http://schemas.openxmlformats.org/officeDocument/2006/relationships" xmlns:m="http://schemas.openxmlformats.org/officeDocument/2006/math" xmlns:v="urn:schemas-microsoft-com:vml" xmlns:wp14="http://schemas.microsoft.com/office/word/2010/wordprocessingDrawing" xmlns:wp="http://schemas.openxmlformats.org/drawingml/2006/wordprocessingDrawing" xmlns:w10="urn:schemas-microsoft-com:office:word" xmlns:w="http://schemas.openxmlformats.org/wordprocessingml/2006/main" xmlns:w14="http://schemas.microsoft.com/office/word/2010/wordml" xmlns:w15="http://schemas.microsoft.com/office/word/2012/wordml" xmlns:w16cex="http://schemas.microsoft.com/office/word/2018/wordml/cex" xmlns:w16cid="http://schemas.microsoft.com/office/word/2016/wordml/cid" xmlns:w16="http://schemas.microsoft.com/office/word/2018/wordml" xmlns:w16du="http://schemas.microsoft.com/office/word/2023/wordml/word16du" xmlns:w16sdtdh="http://schemas.microsoft.com/office/word/2020/wordml/sdtdatahash" xmlns:w16sdtfl="http://schemas.microsoft.com/office/word/2024/wordml/sdtformatlock" xmlns:w16se="http://schemas.microsoft.com/office/word/2015/wordml/symex" xmlns:wpg="http://schemas.microsoft.com/office/word/2010/wordprocessingGroup" xmlns:wpi="http://schemas.microsoft.com/office/word/2010/wordprocessingInk" xmlns:wne="http://schemas.microsoft.com/office/word/2006/wordml" xmlns:wps="http://schemas.microsoft.com/office/word/2010/wordprocessingShape" mc:Ignorable="w14 w15 w16se w16cid w16 w16cex w16sdtdh w16sdtfl w16du wp14">
+<w:endnotes xmlns:wpc="http://schemas.microsoft.com/office/word/2010/wordprocessingCanvas" xmlns:cx="http://schemas.microsoft.com/office/drawing/2014/chartex" xmlns:cx1="http://schemas.microsoft.com/office/drawing/2015/9/8/chartex" xmlns:cx2="http://schemas.microsoft.com/office/drawing/2015/10/21/chartex" xmlns:cx3="http://schemas.microsoft.com/office/drawing/2016/5/9/chartex" xmlns:cx4="http://schemas.microsoft.com/office/drawing/2016/5/10/chartex" xmlns:cx5="http://schemas.microsoft.com/office/drawing/2016/5/11/chartex" xmlns:cx6="http://schemas.microsoft.com/office/drawing/2016/5/12/chartex" xmlns:cx7="http://schemas.microsoft.com/office/drawing/2016/5/13/chartex" xmlns:cx8="http://schemas.microsoft.com/office/drawing/2016/5/14/chartex" xmlns:mc="http://schemas.openxmlformats.org/markup-compatibility/2006" xmlns:aink="http://schemas.microsoft.com/office/drawing/2016/ink" xmlns:am3d="http://schemas.microsoft.com/office/drawing/2017/model3d" xmlns:o="urn:schemas-microsoft-com:office:office" xmlns:r="http://schemas.openxmlformats.org/officeDocument/2006/relationships" xmlns:m="http://schemas.openxmlformats.org/officeDocument/2006/math" xmlns:v="urn:schemas-microsoft-com:vml" xmlns:wp14="http://schemas.microsoft.com/office/word/2010/wordprocessingDrawing" xmlns:wp="http://schemas.openxmlformats.org/drawingml/2006/wordprocessingDrawing" xmlns:w10="urn:schemas-microsoft-com:office:word" xmlns:w="http://schemas.openxmlformats.org/wordprocessingml/2006/main" xmlns:w14="http://schemas.microsoft.com/office/word/2010/wordml" xmlns:w15="http://schemas.microsoft.com/office/word/2012/wordml" xmlns:w16cex="http://schemas.microsoft.com/office/word/2018/wordml/cex" xmlns:w16cid="http://schemas.microsoft.com/office/word/2016/wordml/cid" xmlns:w16="http://schemas.microsoft.com/office/word/2018/wordml" xmlns:w16sdtdh="http://schemas.microsoft.com/office/word/2020/wordml/sdtdatahash" xmlns:w16se="http://schemas.microsoft.com/office/word/2015/wordml/symex" xmlns:wpg="http://schemas.microsoft.com/office/word/2010/wordprocessingGroup" xmlns:wpi="http://schemas.microsoft.com/office/word/2010/wordprocessingInk" xmlns:wne="http://schemas.microsoft.com/office/word/2006/wordml" xmlns:wps="http://schemas.microsoft.com/office/word/2010/wordprocessingShape" mc:Ignorable="w14 w15 w16se w16cid w16 w16cex w16sdtdh wp14">
   <w:endnote w:type="separator" w:id="-1">
     <w:p>
       <w:r>
@@ -25868,7 +25860,7 @@
 </file>
 
 <file path=word/footer1.xml><?xml version="1.0" encoding="utf-8"?>
-<w:ftr xmlns:wpc="http://schemas.microsoft.com/office/word/2010/wordprocessingCanvas" xmlns:cx="http://schemas.microsoft.com/office/drawing/2014/chartex" xmlns:cx1="http://schemas.microsoft.com/office/drawing/2015/9/8/chartex" xmlns:cx2="http://schemas.microsoft.com/office/drawing/2015/10/21/chartex" xmlns:cx3="http://schemas.microsoft.com/office/drawing/2016/5/9/chartex" xmlns:cx4="http://schemas.microsoft.com/office/drawing/2016/5/10/chartex" xmlns:cx5="http://schemas.microsoft.com/office/drawing/2016/5/11/chartex" xmlns:cx6="http://schemas.microsoft.com/office/drawing/2016/5/12/chartex" xmlns:cx7="http://schemas.microsoft.com/office/drawing/2016/5/13/chartex" xmlns:cx8="http://schemas.microsoft.com/office/drawing/2016/5/14/chartex" xmlns:mc="http://schemas.openxmlformats.org/markup-compatibility/2006" xmlns:aink="http://schemas.microsoft.com/office/drawing/2016/ink" xmlns:am3d="http://schemas.microsoft.com/office/drawing/2017/model3d" xmlns:o="urn:schemas-microsoft-com:office:office" xmlns:oel="http://schemas.microsoft.com/office/2019/extlst" xmlns:r="http://schemas.openxmlformats.org/officeDocument/2006/relationships" xmlns:m="http://schemas.openxmlformats.org/officeDocument/2006/math" xmlns:v="urn:schemas-microsoft-com:vml" xmlns:wp14="http://schemas.microsoft.com/office/word/2010/wordprocessingDrawing" xmlns:wp="http://schemas.openxmlformats.org/drawingml/2006/wordprocessingDrawing" xmlns:w10="urn:schemas-microsoft-com:office:word" xmlns:w="http://schemas.openxmlformats.org/wordprocessingml/2006/main" xmlns:w14="http://schemas.microsoft.com/office/word/2010/wordml" xmlns:w15="http://schemas.microsoft.com/office/word/2012/wordml" xmlns:w16cex="http://schemas.microsoft.com/office/word/2018/wordml/cex" xmlns:w16cid="http://schemas.microsoft.com/office/word/2016/wordml/cid" xmlns:w16="http://schemas.microsoft.com/office/word/2018/wordml" xmlns:w16du="http://schemas.microsoft.com/office/word/2023/wordml/word16du" xmlns:w16sdtdh="http://schemas.microsoft.com/office/word/2020/wordml/sdtdatahash" xmlns:w16sdtfl="http://schemas.microsoft.com/office/word/2024/wordml/sdtformatlock" xmlns:w16se="http://schemas.microsoft.com/office/word/2015/wordml/symex" xmlns:wpg="http://schemas.microsoft.com/office/word/2010/wordprocessingGroup" xmlns:wpi="http://schemas.microsoft.com/office/word/2010/wordprocessingInk" xmlns:wne="http://schemas.microsoft.com/office/word/2006/wordml" xmlns:wps="http://schemas.microsoft.com/office/word/2010/wordprocessingShape" mc:Ignorable="w14 w15 w16se w16cid w16 w16cex w16sdtdh w16sdtfl w16du wp14">
+<w:ftr xmlns:wpc="http://schemas.microsoft.com/office/word/2010/wordprocessingCanvas" xmlns:cx="http://schemas.microsoft.com/office/drawing/2014/chartex" xmlns:cx1="http://schemas.microsoft.com/office/drawing/2015/9/8/chartex" xmlns:cx2="http://schemas.microsoft.com/office/drawing/2015/10/21/chartex" xmlns:cx3="http://schemas.microsoft.com/office/drawing/2016/5/9/chartex" xmlns:cx4="http://schemas.microsoft.com/office/drawing/2016/5/10/chartex" xmlns:cx5="http://schemas.microsoft.com/office/drawing/2016/5/11/chartex" xmlns:cx6="http://schemas.microsoft.com/office/drawing/2016/5/12/chartex" xmlns:cx7="http://schemas.microsoft.com/office/drawing/2016/5/13/chartex" xmlns:cx8="http://schemas.microsoft.com/office/drawing/2016/5/14/chartex" xmlns:mc="http://schemas.openxmlformats.org/markup-compatibility/2006" xmlns:aink="http://schemas.microsoft.com/office/drawing/2016/ink" xmlns:am3d="http://schemas.microsoft.com/office/drawing/2017/model3d" xmlns:o="urn:schemas-microsoft-com:office:office" xmlns:r="http://schemas.openxmlformats.org/officeDocument/2006/relationships" xmlns:m="http://schemas.openxmlformats.org/officeDocument/2006/math" xmlns:v="urn:schemas-microsoft-com:vml" xmlns:wp14="http://schemas.microsoft.com/office/word/2010/wordprocessingDrawing" xmlns:wp="http://schemas.openxmlformats.org/drawingml/2006/wordprocessingDrawing" xmlns:w10="urn:schemas-microsoft-com:office:word" xmlns:w="http://schemas.openxmlformats.org/wordprocessingml/2006/main" xmlns:w14="http://schemas.microsoft.com/office/word/2010/wordml" xmlns:w15="http://schemas.microsoft.com/office/word/2012/wordml" xmlns:w16cex="http://schemas.microsoft.com/office/word/2018/wordml/cex" xmlns:w16cid="http://schemas.microsoft.com/office/word/2016/wordml/cid" xmlns:w16="http://schemas.microsoft.com/office/word/2018/wordml" xmlns:w16sdtdh="http://schemas.microsoft.com/office/word/2020/wordml/sdtdatahash" xmlns:w16se="http://schemas.microsoft.com/office/word/2015/wordml/symex" xmlns:wpg="http://schemas.microsoft.com/office/word/2010/wordprocessingGroup" xmlns:wpi="http://schemas.microsoft.com/office/word/2010/wordprocessingInk" xmlns:wne="http://schemas.microsoft.com/office/word/2006/wordml" xmlns:wps="http://schemas.microsoft.com/office/word/2010/wordprocessingShape" mc:Ignorable="w14 w15 w16se w16cid w16 w16cex w16sdtdh wp14">
   <w:p>
     <w:pPr>
       <w:jc w:val="center"/>
@@ -25965,7 +25957,7 @@
 </file>
 
 <file path=word/footer2.xml><?xml version="1.0" encoding="utf-8"?>
-<w:ftr xmlns:wpc="http://schemas.microsoft.com/office/word/2010/wordprocessingCanvas" xmlns:cx="http://schemas.microsoft.com/office/drawing/2014/chartex" xmlns:cx1="http://schemas.microsoft.com/office/drawing/2015/9/8/chartex" xmlns:cx2="http://schemas.microsoft.com/office/drawing/2015/10/21/chartex" xmlns:cx3="http://schemas.microsoft.com/office/drawing/2016/5/9/chartex" xmlns:cx4="http://schemas.microsoft.com/office/drawing/2016/5/10/chartex" xmlns:cx5="http://schemas.microsoft.com/office/drawing/2016/5/11/chartex" xmlns:cx6="http://schemas.microsoft.com/office/drawing/2016/5/12/chartex" xmlns:cx7="http://schemas.microsoft.com/office/drawing/2016/5/13/chartex" xmlns:cx8="http://schemas.microsoft.com/office/drawing/2016/5/14/chartex" xmlns:mc="http://schemas.openxmlformats.org/markup-compatibility/2006" xmlns:aink="http://schemas.microsoft.com/office/drawing/2016/ink" xmlns:am3d="http://schemas.microsoft.com/office/drawing/2017/model3d" xmlns:o="urn:schemas-microsoft-com:office:office" xmlns:oel="http://schemas.microsoft.com/office/2019/extlst" xmlns:r="http://schemas.openxmlformats.org/officeDocument/2006/relationships" xmlns:m="http://schemas.openxmlformats.org/officeDocument/2006/math" xmlns:v="urn:schemas-microsoft-com:vml" xmlns:wp14="http://schemas.microsoft.com/office/word/2010/wordprocessingDrawing" xmlns:wp="http://schemas.openxmlformats.org/drawingml/2006/wordprocessingDrawing" xmlns:w10="urn:schemas-microsoft-com:office:word" xmlns:w="http://schemas.openxmlformats.org/wordprocessingml/2006/main" xmlns:w14="http://schemas.microsoft.com/office/word/2010/wordml" xmlns:w15="http://schemas.microsoft.com/office/word/2012/wordml" xmlns:w16cex="http://schemas.microsoft.com/office/word/2018/wordml/cex" xmlns:w16cid="http://schemas.microsoft.com/office/word/2016/wordml/cid" xmlns:w16="http://schemas.microsoft.com/office/word/2018/wordml" xmlns:w16du="http://schemas.microsoft.com/office/word/2023/wordml/word16du" xmlns:w16sdtdh="http://schemas.microsoft.com/office/word/2020/wordml/sdtdatahash" xmlns:w16sdtfl="http://schemas.microsoft.com/office/word/2024/wordml/sdtformatlock" xmlns:w16se="http://schemas.microsoft.com/office/word/2015/wordml/symex" xmlns:wpg="http://schemas.microsoft.com/office/word/2010/wordprocessingGroup" xmlns:wpi="http://schemas.microsoft.com/office/word/2010/wordprocessingInk" xmlns:wne="http://schemas.microsoft.com/office/word/2006/wordml" xmlns:wps="http://schemas.microsoft.com/office/word/2010/wordprocessingShape" mc:Ignorable="w14 w15 w16se w16cid w16 w16cex w16sdtdh w16sdtfl w16du wp14">
+<w:ftr xmlns:wpc="http://schemas.microsoft.com/office/word/2010/wordprocessingCanvas" xmlns:cx="http://schemas.microsoft.com/office/drawing/2014/chartex" xmlns:cx1="http://schemas.microsoft.com/office/drawing/2015/9/8/chartex" xmlns:cx2="http://schemas.microsoft.com/office/drawing/2015/10/21/chartex" xmlns:cx3="http://schemas.microsoft.com/office/drawing/2016/5/9/chartex" xmlns:cx4="http://schemas.microsoft.com/office/drawing/2016/5/10/chartex" xmlns:cx5="http://schemas.microsoft.com/office/drawing/2016/5/11/chartex" xmlns:cx6="http://schemas.microsoft.com/office/drawing/2016/5/12/chartex" xmlns:cx7="http://schemas.microsoft.com/office/drawing/2016/5/13/chartex" xmlns:cx8="http://schemas.microsoft.com/office/drawing/2016/5/14/chartex" xmlns:mc="http://schemas.openxmlformats.org/markup-compatibility/2006" xmlns:aink="http://schemas.microsoft.com/office/drawing/2016/ink" xmlns:am3d="http://schemas.microsoft.com/office/drawing/2017/model3d" xmlns:o="urn:schemas-microsoft-com:office:office" xmlns:r="http://schemas.openxmlformats.org/officeDocument/2006/relationships" xmlns:m="http://schemas.openxmlformats.org/officeDocument/2006/math" xmlns:v="urn:schemas-microsoft-com:vml" xmlns:wp14="http://schemas.microsoft.com/office/word/2010/wordprocessingDrawing" xmlns:wp="http://schemas.openxmlformats.org/drawingml/2006/wordprocessingDrawing" xmlns:w10="urn:schemas-microsoft-com:office:word" xmlns:w="http://schemas.openxmlformats.org/wordprocessingml/2006/main" xmlns:w14="http://schemas.microsoft.com/office/word/2010/wordml" xmlns:w15="http://schemas.microsoft.com/office/word/2012/wordml" xmlns:w16cex="http://schemas.microsoft.com/office/word/2018/wordml/cex" xmlns:w16cid="http://schemas.microsoft.com/office/word/2016/wordml/cid" xmlns:w16="http://schemas.microsoft.com/office/word/2018/wordml" xmlns:w16sdtdh="http://schemas.microsoft.com/office/word/2020/wordml/sdtdatahash" xmlns:w16se="http://schemas.microsoft.com/office/word/2015/wordml/symex" xmlns:wpg="http://schemas.microsoft.com/office/word/2010/wordprocessingGroup" xmlns:wpi="http://schemas.microsoft.com/office/word/2010/wordprocessingInk" xmlns:wne="http://schemas.microsoft.com/office/word/2006/wordml" xmlns:wps="http://schemas.microsoft.com/office/word/2010/wordprocessingShape" mc:Ignorable="w14 w15 w16se w16cid w16 w16cex w16sdtdh wp14">
   <w:p>
     <w:pPr>
       <w:jc w:val="center"/>
@@ -26062,7 +26054,7 @@
 </file>
 
 <file path=word/footer3.xml><?xml version="1.0" encoding="utf-8"?>
-<w:ftr xmlns:wpc="http://schemas.microsoft.com/office/word/2010/wordprocessingCanvas" xmlns:cx="http://schemas.microsoft.com/office/drawing/2014/chartex" xmlns:cx1="http://schemas.microsoft.com/office/drawing/2015/9/8/chartex" xmlns:cx2="http://schemas.microsoft.com/office/drawing/2015/10/21/chartex" xmlns:cx3="http://schemas.microsoft.com/office/drawing/2016/5/9/chartex" xmlns:cx4="http://schemas.microsoft.com/office/drawing/2016/5/10/chartex" xmlns:cx5="http://schemas.microsoft.com/office/drawing/2016/5/11/chartex" xmlns:cx6="http://schemas.microsoft.com/office/drawing/2016/5/12/chartex" xmlns:cx7="http://schemas.microsoft.com/office/drawing/2016/5/13/chartex" xmlns:cx8="http://schemas.microsoft.com/office/drawing/2016/5/14/chartex" xmlns:mc="http://schemas.openxmlformats.org/markup-compatibility/2006" xmlns:aink="http://schemas.microsoft.com/office/drawing/2016/ink" xmlns:am3d="http://schemas.microsoft.com/office/drawing/2017/model3d" xmlns:o="urn:schemas-microsoft-com:office:office" xmlns:oel="http://schemas.microsoft.com/office/2019/extlst" xmlns:r="http://schemas.openxmlformats.org/officeDocument/2006/relationships" xmlns:m="http://schemas.openxmlformats.org/officeDocument/2006/math" xmlns:v="urn:schemas-microsoft-com:vml" xmlns:wp14="http://schemas.microsoft.com/office/word/2010/wordprocessingDrawing" xmlns:wp="http://schemas.openxmlformats.org/drawingml/2006/wordprocessingDrawing" xmlns:w10="urn:schemas-microsoft-com:office:word" xmlns:w="http://schemas.openxmlformats.org/wordprocessingml/2006/main" xmlns:w14="http://schemas.microsoft.com/office/word/2010/wordml" xmlns:w15="http://schemas.microsoft.com/office/word/2012/wordml" xmlns:w16cex="http://schemas.microsoft.com/office/word/2018/wordml/cex" xmlns:w16cid="http://schemas.microsoft.com/office/word/2016/wordml/cid" xmlns:w16="http://schemas.microsoft.com/office/word/2018/wordml" xmlns:w16du="http://schemas.microsoft.com/office/word/2023/wordml/word16du" xmlns:w16sdtdh="http://schemas.microsoft.com/office/word/2020/wordml/sdtdatahash" xmlns:w16sdtfl="http://schemas.microsoft.com/office/word/2024/wordml/sdtformatlock" xmlns:w16se="http://schemas.microsoft.com/office/word/2015/wordml/symex" xmlns:wpg="http://schemas.microsoft.com/office/word/2010/wordprocessingGroup" xmlns:wpi="http://schemas.microsoft.com/office/word/2010/wordprocessingInk" xmlns:wne="http://schemas.microsoft.com/office/word/2006/wordml" xmlns:wps="http://schemas.microsoft.com/office/word/2010/wordprocessingShape" mc:Ignorable="w14 w15 w16se w16cid w16 w16cex w16sdtdh w16sdtfl w16du wp14">
+<w:ftr xmlns:wpc="http://schemas.microsoft.com/office/word/2010/wordprocessingCanvas" xmlns:cx="http://schemas.microsoft.com/office/drawing/2014/chartex" xmlns:cx1="http://schemas.microsoft.com/office/drawing/2015/9/8/chartex" xmlns:cx2="http://schemas.microsoft.com/office/drawing/2015/10/21/chartex" xmlns:cx3="http://schemas.microsoft.com/office/drawing/2016/5/9/chartex" xmlns:cx4="http://schemas.microsoft.com/office/drawing/2016/5/10/chartex" xmlns:cx5="http://schemas.microsoft.com/office/drawing/2016/5/11/chartex" xmlns:cx6="http://schemas.microsoft.com/office/drawing/2016/5/12/chartex" xmlns:cx7="http://schemas.microsoft.com/office/drawing/2016/5/13/chartex" xmlns:cx8="http://schemas.microsoft.com/office/drawing/2016/5/14/chartex" xmlns:mc="http://schemas.openxmlformats.org/markup-compatibility/2006" xmlns:aink="http://schemas.microsoft.com/office/drawing/2016/ink" xmlns:am3d="http://schemas.microsoft.com/office/drawing/2017/model3d" xmlns:o="urn:schemas-microsoft-com:office:office" xmlns:r="http://schemas.openxmlformats.org/officeDocument/2006/relationships" xmlns:m="http://schemas.openxmlformats.org/officeDocument/2006/math" xmlns:v="urn:schemas-microsoft-com:vml" xmlns:wp14="http://schemas.microsoft.com/office/word/2010/wordprocessingDrawing" xmlns:wp="http://schemas.openxmlformats.org/drawingml/2006/wordprocessingDrawing" xmlns:w10="urn:schemas-microsoft-com:office:word" xmlns:w="http://schemas.openxmlformats.org/wordprocessingml/2006/main" xmlns:w14="http://schemas.microsoft.com/office/word/2010/wordml" xmlns:w15="http://schemas.microsoft.com/office/word/2012/wordml" xmlns:w16cex="http://schemas.microsoft.com/office/word/2018/wordml/cex" xmlns:w16cid="http://schemas.microsoft.com/office/word/2016/wordml/cid" xmlns:w16="http://schemas.microsoft.com/office/word/2018/wordml" xmlns:w16sdtdh="http://schemas.microsoft.com/office/word/2020/wordml/sdtdatahash" xmlns:w16se="http://schemas.microsoft.com/office/word/2015/wordml/symex" xmlns:wpg="http://schemas.microsoft.com/office/word/2010/wordprocessingGroup" xmlns:wpi="http://schemas.microsoft.com/office/word/2010/wordprocessingInk" xmlns:wne="http://schemas.microsoft.com/office/word/2006/wordml" xmlns:wps="http://schemas.microsoft.com/office/word/2010/wordprocessingShape" mc:Ignorable="w14 w15 w16se w16cid w16 w16cex w16sdtdh wp14">
   <w:p>
     <w:pPr>
       <w:jc w:val="center"/>
@@ -26159,7 +26151,7 @@
 </file>
 
 <file path=word/footer4.xml><?xml version="1.0" encoding="utf-8"?>
-<w:ftr xmlns:wpc="http://schemas.microsoft.com/office/word/2010/wordprocessingCanvas" xmlns:cx="http://schemas.microsoft.com/office/drawing/2014/chartex" xmlns:cx1="http://schemas.microsoft.com/office/drawing/2015/9/8/chartex" xmlns:cx2="http://schemas.microsoft.com/office/drawing/2015/10/21/chartex" xmlns:cx3="http://schemas.microsoft.com/office/drawing/2016/5/9/chartex" xmlns:cx4="http://schemas.microsoft.com/office/drawing/2016/5/10/chartex" xmlns:cx5="http://schemas.microsoft.com/office/drawing/2016/5/11/chartex" xmlns:cx6="http://schemas.microsoft.com/office/drawing/2016/5/12/chartex" xmlns:cx7="http://schemas.microsoft.com/office/drawing/2016/5/13/chartex" xmlns:cx8="http://schemas.microsoft.com/office/drawing/2016/5/14/chartex" xmlns:mc="http://schemas.openxmlformats.org/markup-compatibility/2006" xmlns:aink="http://schemas.microsoft.com/office/drawing/2016/ink" xmlns:am3d="http://schemas.microsoft.com/office/drawing/2017/model3d" xmlns:o="urn:schemas-microsoft-com:office:office" xmlns:oel="http://schemas.microsoft.com/office/2019/extlst" xmlns:r="http://schemas.openxmlformats.org/officeDocument/2006/relationships" xmlns:m="http://schemas.openxmlformats.org/officeDocument/2006/math" xmlns:v="urn:schemas-microsoft-com:vml" xmlns:wp14="http://schemas.microsoft.com/office/word/2010/wordprocessingDrawing" xmlns:wp="http://schemas.openxmlformats.org/drawingml/2006/wordprocessingDrawing" xmlns:w10="urn:schemas-microsoft-com:office:word" xmlns:w="http://schemas.openxmlformats.org/wordprocessingml/2006/main" xmlns:w14="http://schemas.microsoft.com/office/word/2010/wordml" xmlns:w15="http://schemas.microsoft.com/office/word/2012/wordml" xmlns:w16cex="http://schemas.microsoft.com/office/word/2018/wordml/cex" xmlns:w16cid="http://schemas.microsoft.com/office/word/2016/wordml/cid" xmlns:w16="http://schemas.microsoft.com/office/word/2018/wordml" xmlns:w16du="http://schemas.microsoft.com/office/word/2023/wordml/word16du" xmlns:w16sdtdh="http://schemas.microsoft.com/office/word/2020/wordml/sdtdatahash" xmlns:w16sdtfl="http://schemas.microsoft.com/office/word/2024/wordml/sdtformatlock" xmlns:w16se="http://schemas.microsoft.com/office/word/2015/wordml/symex" xmlns:wpg="http://schemas.microsoft.com/office/word/2010/wordprocessingGroup" xmlns:wpi="http://schemas.microsoft.com/office/word/2010/wordprocessingInk" xmlns:wne="http://schemas.microsoft.com/office/word/2006/wordml" xmlns:wps="http://schemas.microsoft.com/office/word/2010/wordprocessingShape" mc:Ignorable="w14 w15 w16se w16cid w16 w16cex w16sdtdh w16sdtfl w16du wp14">
+<w:ftr xmlns:wpc="http://schemas.microsoft.com/office/word/2010/wordprocessingCanvas" xmlns:cx="http://schemas.microsoft.com/office/drawing/2014/chartex" xmlns:cx1="http://schemas.microsoft.com/office/drawing/2015/9/8/chartex" xmlns:cx2="http://schemas.microsoft.com/office/drawing/2015/10/21/chartex" xmlns:cx3="http://schemas.microsoft.com/office/drawing/2016/5/9/chartex" xmlns:cx4="http://schemas.microsoft.com/office/drawing/2016/5/10/chartex" xmlns:cx5="http://schemas.microsoft.com/office/drawing/2016/5/11/chartex" xmlns:cx6="http://schemas.microsoft.com/office/drawing/2016/5/12/chartex" xmlns:cx7="http://schemas.microsoft.com/office/drawing/2016/5/13/chartex" xmlns:cx8="http://schemas.microsoft.com/office/drawing/2016/5/14/chartex" xmlns:mc="http://schemas.openxmlformats.org/markup-compatibility/2006" xmlns:aink="http://schemas.microsoft.com/office/drawing/2016/ink" xmlns:am3d="http://schemas.microsoft.com/office/drawing/2017/model3d" xmlns:o="urn:schemas-microsoft-com:office:office" xmlns:r="http://schemas.openxmlformats.org/officeDocument/2006/relationships" xmlns:m="http://schemas.openxmlformats.org/officeDocument/2006/math" xmlns:v="urn:schemas-microsoft-com:vml" xmlns:wp14="http://schemas.microsoft.com/office/word/2010/wordprocessingDrawing" xmlns:wp="http://schemas.openxmlformats.org/drawingml/2006/wordprocessingDrawing" xmlns:w10="urn:schemas-microsoft-com:office:word" xmlns:w="http://schemas.openxmlformats.org/wordprocessingml/2006/main" xmlns:w14="http://schemas.microsoft.com/office/word/2010/wordml" xmlns:w15="http://schemas.microsoft.com/office/word/2012/wordml" xmlns:w16cex="http://schemas.microsoft.com/office/word/2018/wordml/cex" xmlns:w16cid="http://schemas.microsoft.com/office/word/2016/wordml/cid" xmlns:w16="http://schemas.microsoft.com/office/word/2018/wordml" xmlns:w16sdtdh="http://schemas.microsoft.com/office/word/2020/wordml/sdtdatahash" xmlns:w16se="http://schemas.microsoft.com/office/word/2015/wordml/symex" xmlns:wpg="http://schemas.microsoft.com/office/word/2010/wordprocessingGroup" xmlns:wpi="http://schemas.microsoft.com/office/word/2010/wordprocessingInk" xmlns:wne="http://schemas.microsoft.com/office/word/2006/wordml" xmlns:wps="http://schemas.microsoft.com/office/word/2010/wordprocessingShape" mc:Ignorable="w14 w15 w16se w16cid w16 w16cex w16sdtdh wp14">
   <w:p>
     <w:pPr>
       <w:jc w:val="center"/>
@@ -26256,7 +26248,7 @@
 </file>
 
 <file path=word/footnotes.xml><?xml version="1.0" encoding="utf-8"?>
-<w:footnotes xmlns:wpc="http://schemas.microsoft.com/office/word/2010/wordprocessingCanvas" xmlns:cx="http://schemas.microsoft.com/office/drawing/2014/chartex" xmlns:cx1="http://schemas.microsoft.com/office/drawing/2015/9/8/chartex" xmlns:cx2="http://schemas.microsoft.com/office/drawing/2015/10/21/chartex" xmlns:cx3="http://schemas.microsoft.com/office/drawing/2016/5/9/chartex" xmlns:cx4="http://schemas.microsoft.com/office/drawing/2016/5/10/chartex" xmlns:cx5="http://schemas.microsoft.com/office/drawing/2016/5/11/chartex" xmlns:cx6="http://schemas.microsoft.com/office/drawing/2016/5/12/chartex" xmlns:cx7="http://schemas.microsoft.com/office/drawing/2016/5/13/chartex" xmlns:cx8="http://schemas.microsoft.com/office/drawing/2016/5/14/chartex" xmlns:mc="http://schemas.openxmlformats.org/markup-compatibility/2006" xmlns:aink="http://schemas.microsoft.com/office/drawing/2016/ink" xmlns:am3d="http://schemas.microsoft.com/office/drawing/2017/model3d" xmlns:o="urn:schemas-microsoft-com:office:office" xmlns:oel="http://schemas.microsoft.com/office/2019/extlst" xmlns:r="http://schemas.openxmlformats.org/officeDocument/2006/relationships" xmlns:m="http://schemas.openxmlformats.org/officeDocument/2006/math" xmlns:v="urn:schemas-microsoft-com:vml" xmlns:wp14="http://schemas.microsoft.com/office/word/2010/wordprocessingDrawing" xmlns:wp="http://schemas.openxmlformats.org/drawingml/2006/wordprocessingDrawing" xmlns:w10="urn:schemas-microsoft-com:office:word" xmlns:w="http://schemas.openxmlformats.org/wordprocessingml/2006/main" xmlns:w14="http://schemas.microsoft.com/office/word/2010/wordml" xmlns:w15="http://schemas.microsoft.com/office/word/2012/wordml" xmlns:w16cex="http://schemas.microsoft.com/office/word/2018/wordml/cex" xmlns:w16cid="http://schemas.microsoft.com/office/word/2016/wordml/cid" xmlns:w16="http://schemas.microsoft.com/office/word/2018/wordml" xmlns:w16du="http://schemas.microsoft.com/office/word/2023/wordml/word16du" xmlns:w16sdtdh="http://schemas.microsoft.com/office/word/2020/wordml/sdtdatahash" xmlns:w16sdtfl="http://schemas.microsoft.com/office/word/2024/wordml/sdtformatlock" xmlns:w16se="http://schemas.microsoft.com/office/word/2015/wordml/symex" xmlns:wpg="http://schemas.microsoft.com/office/word/2010/wordprocessingGroup" xmlns:wpi="http://schemas.microsoft.com/office/word/2010/wordprocessingInk" xmlns:wne="http://schemas.microsoft.com/office/word/2006/wordml" xmlns:wps="http://schemas.microsoft.com/office/word/2010/wordprocessingShape" mc:Ignorable="w14 w15 w16se w16cid w16 w16cex w16sdtdh w16sdtfl w16du wp14">
+<w:footnotes xmlns:wpc="http://schemas.microsoft.com/office/word/2010/wordprocessingCanvas" xmlns:cx="http://schemas.microsoft.com/office/drawing/2014/chartex" xmlns:cx1="http://schemas.microsoft.com/office/drawing/2015/9/8/chartex" xmlns:cx2="http://schemas.microsoft.com/office/drawing/2015/10/21/chartex" xmlns:cx3="http://schemas.microsoft.com/office/drawing/2016/5/9/chartex" xmlns:cx4="http://schemas.microsoft.com/office/drawing/2016/5/10/chartex" xmlns:cx5="http://schemas.microsoft.com/office/drawing/2016/5/11/chartex" xmlns:cx6="http://schemas.microsoft.com/office/drawing/2016/5/12/chartex" xmlns:cx7="http://schemas.microsoft.com/office/drawing/2016/5/13/chartex" xmlns:cx8="http://schemas.microsoft.com/office/drawing/2016/5/14/chartex" xmlns:mc="http://schemas.openxmlformats.org/markup-compatibility/2006" xmlns:aink="http://schemas.microsoft.com/office/drawing/2016/ink" xmlns:am3d="http://schemas.microsoft.com/office/drawing/2017/model3d" xmlns:o="urn:schemas-microsoft-com:office:office" xmlns:r="http://schemas.openxmlformats.org/officeDocument/2006/relationships" xmlns:m="http://schemas.openxmlformats.org/officeDocument/2006/math" xmlns:v="urn:schemas-microsoft-com:vml" xmlns:wp14="http://schemas.microsoft.com/office/word/2010/wordprocessingDrawing" xmlns:wp="http://schemas.openxmlformats.org/drawingml/2006/wordprocessingDrawing" xmlns:w10="urn:schemas-microsoft-com:office:word" xmlns:w="http://schemas.openxmlformats.org/wordprocessingml/2006/main" xmlns:w14="http://schemas.microsoft.com/office/word/2010/wordml" xmlns:w15="http://schemas.microsoft.com/office/word/2012/wordml" xmlns:w16cex="http://schemas.microsoft.com/office/word/2018/wordml/cex" xmlns:w16cid="http://schemas.microsoft.com/office/word/2016/wordml/cid" xmlns:w16="http://schemas.microsoft.com/office/word/2018/wordml" xmlns:w16sdtdh="http://schemas.microsoft.com/office/word/2020/wordml/sdtdatahash" xmlns:w16se="http://schemas.microsoft.com/office/word/2015/wordml/symex" xmlns:wpg="http://schemas.microsoft.com/office/word/2010/wordprocessingGroup" xmlns:wpi="http://schemas.microsoft.com/office/word/2010/wordprocessingInk" xmlns:wne="http://schemas.microsoft.com/office/word/2006/wordml" xmlns:wps="http://schemas.microsoft.com/office/word/2010/wordprocessingShape" mc:Ignorable="w14 w15 w16se w16cid w16 w16cex w16sdtdh wp14">
   <w:footnote w:type="separator" w:id="-1">
     <w:p>
       <w:r>
@@ -26275,7 +26267,7 @@
 </file>
 
 <file path=word/header1.xml><?xml version="1.0" encoding="utf-8"?>
-<w:hdr xmlns:wpc="http://schemas.microsoft.com/office/word/2010/wordprocessingCanvas" xmlns:cx="http://schemas.microsoft.com/office/drawing/2014/chartex" xmlns:cx1="http://schemas.microsoft.com/office/drawing/2015/9/8/chartex" xmlns:cx2="http://schemas.microsoft.com/office/drawing/2015/10/21/chartex" xmlns:cx3="http://schemas.microsoft.com/office/drawing/2016/5/9/chartex" xmlns:cx4="http://schemas.microsoft.com/office/drawing/2016/5/10/chartex" xmlns:cx5="http://schemas.microsoft.com/office/drawing/2016/5/11/chartex" xmlns:cx6="http://schemas.microsoft.com/office/drawing/2016/5/12/chartex" xmlns:cx7="http://schemas.microsoft.com/office/drawing/2016/5/13/chartex" xmlns:cx8="http://schemas.microsoft.com/office/drawing/2016/5/14/chartex" xmlns:mc="http://schemas.openxmlformats.org/markup-compatibility/2006" xmlns:aink="http://schemas.microsoft.com/office/drawing/2016/ink" xmlns:am3d="http://schemas.microsoft.com/office/drawing/2017/model3d" xmlns:o="urn:schemas-microsoft-com:office:office" xmlns:oel="http://schemas.microsoft.com/office/2019/extlst" xmlns:r="http://schemas.openxmlformats.org/officeDocument/2006/relationships" xmlns:m="http://schemas.openxmlformats.org/officeDocument/2006/math" xmlns:v="urn:schemas-microsoft-com:vml" xmlns:wp14="http://schemas.microsoft.com/office/word/2010/wordprocessingDrawing" xmlns:wp="http://schemas.openxmlformats.org/drawingml/2006/wordprocessingDrawing" xmlns:w10="urn:schemas-microsoft-com:office:word" xmlns:w="http://schemas.openxmlformats.org/wordprocessingml/2006/main" xmlns:w14="http://schemas.microsoft.com/office/word/2010/wordml" xmlns:w15="http://schemas.microsoft.com/office/word/2012/wordml" xmlns:w16cex="http://schemas.microsoft.com/office/word/2018/wordml/cex" xmlns:w16cid="http://schemas.microsoft.com/office/word/2016/wordml/cid" xmlns:w16="http://schemas.microsoft.com/office/word/2018/wordml" xmlns:w16du="http://schemas.microsoft.com/office/word/2023/wordml/word16du" xmlns:w16sdtdh="http://schemas.microsoft.com/office/word/2020/wordml/sdtdatahash" xmlns:w16sdtfl="http://schemas.microsoft.com/office/word/2024/wordml/sdtformatlock" xmlns:w16se="http://schemas.microsoft.com/office/word/2015/wordml/symex" xmlns:wpg="http://schemas.microsoft.com/office/word/2010/wordprocessingGroup" xmlns:wpi="http://schemas.microsoft.com/office/word/2010/wordprocessingInk" xmlns:wne="http://schemas.microsoft.com/office/word/2006/wordml" xmlns:wps="http://schemas.microsoft.com/office/word/2010/wordprocessingShape" mc:Ignorable="w14 w15 w16se w16cid w16 w16cex w16sdtdh w16sdtfl w16du wp14">
+<w:hdr xmlns:wpc="http://schemas.microsoft.com/office/word/2010/wordprocessingCanvas" xmlns:cx="http://schemas.microsoft.com/office/drawing/2014/chartex" xmlns:cx1="http://schemas.microsoft.com/office/drawing/2015/9/8/chartex" xmlns:cx2="http://schemas.microsoft.com/office/drawing/2015/10/21/chartex" xmlns:cx3="http://schemas.microsoft.com/office/drawing/2016/5/9/chartex" xmlns:cx4="http://schemas.microsoft.com/office/drawing/2016/5/10/chartex" xmlns:cx5="http://schemas.microsoft.com/office/drawing/2016/5/11/chartex" xmlns:cx6="http://schemas.microsoft.com/office/drawing/2016/5/12/chartex" xmlns:cx7="http://schemas.microsoft.com/office/drawing/2016/5/13/chartex" xmlns:cx8="http://schemas.microsoft.com/office/drawing/2016/5/14/chartex" xmlns:mc="http://schemas.openxmlformats.org/markup-compatibility/2006" xmlns:aink="http://schemas.microsoft.com/office/drawing/2016/ink" xmlns:am3d="http://schemas.microsoft.com/office/drawing/2017/model3d" xmlns:o="urn:schemas-microsoft-com:office:office" xmlns:r="http://schemas.openxmlformats.org/officeDocument/2006/relationships" xmlns:m="http://schemas.openxmlformats.org/officeDocument/2006/math" xmlns:v="urn:schemas-microsoft-com:vml" xmlns:wp14="http://schemas.microsoft.com/office/word/2010/wordprocessingDrawing" xmlns:wp="http://schemas.openxmlformats.org/drawingml/2006/wordprocessingDrawing" xmlns:w10="urn:schemas-microsoft-com:office:word" xmlns:w="http://schemas.openxmlformats.org/wordprocessingml/2006/main" xmlns:w14="http://schemas.microsoft.com/office/word/2010/wordml" xmlns:w15="http://schemas.microsoft.com/office/word/2012/wordml" xmlns:w16cex="http://schemas.microsoft.com/office/word/2018/wordml/cex" xmlns:w16cid="http://schemas.microsoft.com/office/word/2016/wordml/cid" xmlns:w16="http://schemas.microsoft.com/office/word/2018/wordml" xmlns:w16sdtdh="http://schemas.microsoft.com/office/word/2020/wordml/sdtdatahash" xmlns:w16se="http://schemas.microsoft.com/office/word/2015/wordml/symex" xmlns:wpg="http://schemas.microsoft.com/office/word/2010/wordprocessingGroup" xmlns:wpi="http://schemas.microsoft.com/office/word/2010/wordprocessingInk" xmlns:wne="http://schemas.microsoft.com/office/word/2006/wordml" xmlns:wps="http://schemas.microsoft.com/office/word/2010/wordprocessingShape" mc:Ignorable="w14 w15 w16se w16cid w16 w16cex w16sdtdh wp14">
   <w:p>
     <w:pPr>
       <w:jc w:val="right"/>
@@ -26329,7 +26321,7 @@
 </file>
 
 <file path=word/header2.xml><?xml version="1.0" encoding="utf-8"?>
-<w:hdr xmlns:wpc="http://schemas.microsoft.com/office/word/2010/wordprocessingCanvas" xmlns:cx="http://schemas.microsoft.com/office/drawing/2014/chartex" xmlns:cx1="http://schemas.microsoft.com/office/drawing/2015/9/8/chartex" xmlns:cx2="http://schemas.microsoft.com/office/drawing/2015/10/21/chartex" xmlns:cx3="http://schemas.microsoft.com/office/drawing/2016/5/9/chartex" xmlns:cx4="http://schemas.microsoft.com/office/drawing/2016/5/10/chartex" xmlns:cx5="http://schemas.microsoft.com/office/drawing/2016/5/11/chartex" xmlns:cx6="http://schemas.microsoft.com/office/drawing/2016/5/12/chartex" xmlns:cx7="http://schemas.microsoft.com/office/drawing/2016/5/13/chartex" xmlns:cx8="http://schemas.microsoft.com/office/drawing/2016/5/14/chartex" xmlns:mc="http://schemas.openxmlformats.org/markup-compatibility/2006" xmlns:aink="http://schemas.microsoft.com/office/drawing/2016/ink" xmlns:am3d="http://schemas.microsoft.com/office/drawing/2017/model3d" xmlns:o="urn:schemas-microsoft-com:office:office" xmlns:oel="http://schemas.microsoft.com/office/2019/extlst" xmlns:r="http://schemas.openxmlformats.org/officeDocument/2006/relationships" xmlns:m="http://schemas.openxmlformats.org/officeDocument/2006/math" xmlns:v="urn:schemas-microsoft-com:vml" xmlns:wp14="http://schemas.microsoft.com/office/word/2010/wordprocessingDrawing" xmlns:wp="http://schemas.openxmlformats.org/drawingml/2006/wordprocessingDrawing" xmlns:w10="urn:schemas-microsoft-com:office:word" xmlns:w="http://schemas.openxmlformats.org/wordprocessingml/2006/main" xmlns:w14="http://schemas.microsoft.com/office/word/2010/wordml" xmlns:w15="http://schemas.microsoft.com/office/word/2012/wordml" xmlns:w16cex="http://schemas.microsoft.com/office/word/2018/wordml/cex" xmlns:w16cid="http://schemas.microsoft.com/office/word/2016/wordml/cid" xmlns:w16="http://schemas.microsoft.com/office/word/2018/wordml" xmlns:w16du="http://schemas.microsoft.com/office/word/2023/wordml/word16du" xmlns:w16sdtdh="http://schemas.microsoft.com/office/word/2020/wordml/sdtdatahash" xmlns:w16sdtfl="http://schemas.microsoft.com/office/word/2024/wordml/sdtformatlock" xmlns:w16se="http://schemas.microsoft.com/office/word/2015/wordml/symex" xmlns:wpg="http://schemas.microsoft.com/office/word/2010/wordprocessingGroup" xmlns:wpi="http://schemas.microsoft.com/office/word/2010/wordprocessingInk" xmlns:wne="http://schemas.microsoft.com/office/word/2006/wordml" xmlns:wps="http://schemas.microsoft.com/office/word/2010/wordprocessingShape" mc:Ignorable="w14 w15 w16se w16cid w16 w16cex w16sdtdh w16sdtfl w16du wp14">
+<w:hdr xmlns:wpc="http://schemas.microsoft.com/office/word/2010/wordprocessingCanvas" xmlns:cx="http://schemas.microsoft.com/office/drawing/2014/chartex" xmlns:cx1="http://schemas.microsoft.com/office/drawing/2015/9/8/chartex" xmlns:cx2="http://schemas.microsoft.com/office/drawing/2015/10/21/chartex" xmlns:cx3="http://schemas.microsoft.com/office/drawing/2016/5/9/chartex" xmlns:cx4="http://schemas.microsoft.com/office/drawing/2016/5/10/chartex" xmlns:cx5="http://schemas.microsoft.com/office/drawing/2016/5/11/chartex" xmlns:cx6="http://schemas.microsoft.com/office/drawing/2016/5/12/chartex" xmlns:cx7="http://schemas.microsoft.com/office/drawing/2016/5/13/chartex" xmlns:cx8="http://schemas.microsoft.com/office/drawing/2016/5/14/chartex" xmlns:mc="http://schemas.openxmlformats.org/markup-compatibility/2006" xmlns:aink="http://schemas.microsoft.com/office/drawing/2016/ink" xmlns:am3d="http://schemas.microsoft.com/office/drawing/2017/model3d" xmlns:o="urn:schemas-microsoft-com:office:office" xmlns:r="http://schemas.openxmlformats.org/officeDocument/2006/relationships" xmlns:m="http://schemas.openxmlformats.org/officeDocument/2006/math" xmlns:v="urn:schemas-microsoft-com:vml" xmlns:wp14="http://schemas.microsoft.com/office/word/2010/wordprocessingDrawing" xmlns:wp="http://schemas.openxmlformats.org/drawingml/2006/wordprocessingDrawing" xmlns:w10="urn:schemas-microsoft-com:office:word" xmlns:w="http://schemas.openxmlformats.org/wordprocessingml/2006/main" xmlns:w14="http://schemas.microsoft.com/office/word/2010/wordml" xmlns:w15="http://schemas.microsoft.com/office/word/2012/wordml" xmlns:w16cex="http://schemas.microsoft.com/office/word/2018/wordml/cex" xmlns:w16cid="http://schemas.microsoft.com/office/word/2016/wordml/cid" xmlns:w16="http://schemas.microsoft.com/office/word/2018/wordml" xmlns:w16sdtdh="http://schemas.microsoft.com/office/word/2020/wordml/sdtdatahash" xmlns:w16se="http://schemas.microsoft.com/office/word/2015/wordml/symex" xmlns:wpg="http://schemas.microsoft.com/office/word/2010/wordprocessingGroup" xmlns:wpi="http://schemas.microsoft.com/office/word/2010/wordprocessingInk" xmlns:wne="http://schemas.microsoft.com/office/word/2006/wordml" xmlns:wps="http://schemas.microsoft.com/office/word/2010/wordprocessingShape" mc:Ignorable="w14 w15 w16se w16cid w16 w16cex w16sdtdh wp14">
   <w:p>
     <w:pPr>
       <w:jc w:val="right"/>
@@ -26383,7 +26375,7 @@
 </file>
 
 <file path=word/header3.xml><?xml version="1.0" encoding="utf-8"?>
-<w:hdr xmlns:wpc="http://schemas.microsoft.com/office/word/2010/wordprocessingCanvas" xmlns:cx="http://schemas.microsoft.com/office/drawing/2014/chartex" xmlns:cx1="http://schemas.microsoft.com/office/drawing/2015/9/8/chartex" xmlns:cx2="http://schemas.microsoft.com/office/drawing/2015/10/21/chartex" xmlns:cx3="http://schemas.microsoft.com/office/drawing/2016/5/9/chartex" xmlns:cx4="http://schemas.microsoft.com/office/drawing/2016/5/10/chartex" xmlns:cx5="http://schemas.microsoft.com/office/drawing/2016/5/11/chartex" xmlns:cx6="http://schemas.microsoft.com/office/drawing/2016/5/12/chartex" xmlns:cx7="http://schemas.microsoft.com/office/drawing/2016/5/13/chartex" xmlns:cx8="http://schemas.microsoft.com/office/drawing/2016/5/14/chartex" xmlns:mc="http://schemas.openxmlformats.org/markup-compatibility/2006" xmlns:aink="http://schemas.microsoft.com/office/drawing/2016/ink" xmlns:am3d="http://schemas.microsoft.com/office/drawing/2017/model3d" xmlns:o="urn:schemas-microsoft-com:office:office" xmlns:oel="http://schemas.microsoft.com/office/2019/extlst" xmlns:r="http://schemas.openxmlformats.org/officeDocument/2006/relationships" xmlns:m="http://schemas.openxmlformats.org/officeDocument/2006/math" xmlns:v="urn:schemas-microsoft-com:vml" xmlns:wp14="http://schemas.microsoft.com/office/word/2010/wordprocessingDrawing" xmlns:wp="http://schemas.openxmlformats.org/drawingml/2006/wordprocessingDrawing" xmlns:w10="urn:schemas-microsoft-com:office:word" xmlns:w="http://schemas.openxmlformats.org/wordprocessingml/2006/main" xmlns:w14="http://schemas.microsoft.com/office/word/2010/wordml" xmlns:w15="http://schemas.microsoft.com/office/word/2012/wordml" xmlns:w16cex="http://schemas.microsoft.com/office/word/2018/wordml/cex" xmlns:w16cid="http://schemas.microsoft.com/office/word/2016/wordml/cid" xmlns:w16="http://schemas.microsoft.com/office/word/2018/wordml" xmlns:w16du="http://schemas.microsoft.com/office/word/2023/wordml/word16du" xmlns:w16sdtdh="http://schemas.microsoft.com/office/word/2020/wordml/sdtdatahash" xmlns:w16sdtfl="http://schemas.microsoft.com/office/word/2024/wordml/sdtformatlock" xmlns:w16se="http://schemas.microsoft.com/office/word/2015/wordml/symex" xmlns:wpg="http://schemas.microsoft.com/office/word/2010/wordprocessingGroup" xmlns:wpi="http://schemas.microsoft.com/office/word/2010/wordprocessingInk" xmlns:wne="http://schemas.microsoft.com/office/word/2006/wordml" xmlns:wps="http://schemas.microsoft.com/office/word/2010/wordprocessingShape" mc:Ignorable="w14 w15 w16se w16cid w16 w16cex w16sdtdh w16sdtfl w16du wp14">
+<w:hdr xmlns:wpc="http://schemas.microsoft.com/office/word/2010/wordprocessingCanvas" xmlns:cx="http://schemas.microsoft.com/office/drawing/2014/chartex" xmlns:cx1="http://schemas.microsoft.com/office/drawing/2015/9/8/chartex" xmlns:cx2="http://schemas.microsoft.com/office/drawing/2015/10/21/chartex" xmlns:cx3="http://schemas.microsoft.com/office/drawing/2016/5/9/chartex" xmlns:cx4="http://schemas.microsoft.com/office/drawing/2016/5/10/chartex" xmlns:cx5="http://schemas.microsoft.com/office/drawing/2016/5/11/chartex" xmlns:cx6="http://schemas.microsoft.com/office/drawing/2016/5/12/chartex" xmlns:cx7="http://schemas.microsoft.com/office/drawing/2016/5/13/chartex" xmlns:cx8="http://schemas.microsoft.com/office/drawing/2016/5/14/chartex" xmlns:mc="http://schemas.openxmlformats.org/markup-compatibility/2006" xmlns:aink="http://schemas.microsoft.com/office/drawing/2016/ink" xmlns:am3d="http://schemas.microsoft.com/office/drawing/2017/model3d" xmlns:o="urn:schemas-microsoft-com:office:office" xmlns:r="http://schemas.openxmlformats.org/officeDocument/2006/relationships" xmlns:m="http://schemas.openxmlformats.org/officeDocument/2006/math" xmlns:v="urn:schemas-microsoft-com:vml" xmlns:wp14="http://schemas.microsoft.com/office/word/2010/wordprocessingDrawing" xmlns:wp="http://schemas.openxmlformats.org/drawingml/2006/wordprocessingDrawing" xmlns:w10="urn:schemas-microsoft-com:office:word" xmlns:w="http://schemas.openxmlformats.org/wordprocessingml/2006/main" xmlns:w14="http://schemas.microsoft.com/office/word/2010/wordml" xmlns:w15="http://schemas.microsoft.com/office/word/2012/wordml" xmlns:w16cex="http://schemas.microsoft.com/office/word/2018/wordml/cex" xmlns:w16cid="http://schemas.microsoft.com/office/word/2016/wordml/cid" xmlns:w16="http://schemas.microsoft.com/office/word/2018/wordml" xmlns:w16sdtdh="http://schemas.microsoft.com/office/word/2020/wordml/sdtdatahash" xmlns:w16se="http://schemas.microsoft.com/office/word/2015/wordml/symex" xmlns:wpg="http://schemas.microsoft.com/office/word/2010/wordprocessingGroup" xmlns:wpi="http://schemas.microsoft.com/office/word/2010/wordprocessingInk" xmlns:wne="http://schemas.microsoft.com/office/word/2006/wordml" xmlns:wps="http://schemas.microsoft.com/office/word/2010/wordprocessingShape" mc:Ignorable="w14 w15 w16se w16cid w16 w16cex w16sdtdh wp14">
   <w:p>
     <w:pPr>
       <w:jc w:val="right"/>
@@ -26437,7 +26429,7 @@
 </file>
 
 <file path=word/header4.xml><?xml version="1.0" encoding="utf-8"?>
-<w:hdr xmlns:wpc="http://schemas.microsoft.com/office/word/2010/wordprocessingCanvas" xmlns:cx="http://schemas.microsoft.com/office/drawing/2014/chartex" xmlns:cx1="http://schemas.microsoft.com/office/drawing/2015/9/8/chartex" xmlns:cx2="http://schemas.microsoft.com/office/drawing/2015/10/21/chartex" xmlns:cx3="http://schemas.microsoft.com/office/drawing/2016/5/9/chartex" xmlns:cx4="http://schemas.microsoft.com/office/drawing/2016/5/10/chartex" xmlns:cx5="http://schemas.microsoft.com/office/drawing/2016/5/11/chartex" xmlns:cx6="http://schemas.microsoft.com/office/drawing/2016/5/12/chartex" xmlns:cx7="http://schemas.microsoft.com/office/drawing/2016/5/13/chartex" xmlns:cx8="http://schemas.microsoft.com/office/drawing/2016/5/14/chartex" xmlns:mc="http://schemas.openxmlformats.org/markup-compatibility/2006" xmlns:aink="http://schemas.microsoft.com/office/drawing/2016/ink" xmlns:am3d="http://schemas.microsoft.com/office/drawing/2017/model3d" xmlns:o="urn:schemas-microsoft-com:office:office" xmlns:oel="http://schemas.microsoft.com/office/2019/extlst" xmlns:r="http://schemas.openxmlformats.org/officeDocument/2006/relationships" xmlns:m="http://schemas.openxmlformats.org/officeDocument/2006/math" xmlns:v="urn:schemas-microsoft-com:vml" xmlns:wp14="http://schemas.microsoft.com/office/word/2010/wordprocessingDrawing" xmlns:wp="http://schemas.openxmlformats.org/drawingml/2006/wordprocessingDrawing" xmlns:w10="urn:schemas-microsoft-com:office:word" xmlns:w="http://schemas.openxmlformats.org/wordprocessingml/2006/main" xmlns:w14="http://schemas.microsoft.com/office/word/2010/wordml" xmlns:w15="http://schemas.microsoft.com/office/word/2012/wordml" xmlns:w16cex="http://schemas.microsoft.com/office/word/2018/wordml/cex" xmlns:w16cid="http://schemas.microsoft.com/office/word/2016/wordml/cid" xmlns:w16="http://schemas.microsoft.com/office/word/2018/wordml" xmlns:w16du="http://schemas.microsoft.com/office/word/2023/wordml/word16du" xmlns:w16sdtdh="http://schemas.microsoft.com/office/word/2020/wordml/sdtdatahash" xmlns:w16sdtfl="http://schemas.microsoft.com/office/word/2024/wordml/sdtformatlock" xmlns:w16se="http://schemas.microsoft.com/office/word/2015/wordml/symex" xmlns:wpg="http://schemas.microsoft.com/office/word/2010/wordprocessingGroup" xmlns:wpi="http://schemas.microsoft.com/office/word/2010/wordprocessingInk" xmlns:wne="http://schemas.microsoft.com/office/word/2006/wordml" xmlns:wps="http://schemas.microsoft.com/office/word/2010/wordprocessingShape" mc:Ignorable="w14 w15 w16se w16cid w16 w16cex w16sdtdh w16sdtfl w16du wp14">
+<w:hdr xmlns:wpc="http://schemas.microsoft.com/office/word/2010/wordprocessingCanvas" xmlns:cx="http://schemas.microsoft.com/office/drawing/2014/chartex" xmlns:cx1="http://schemas.microsoft.com/office/drawing/2015/9/8/chartex" xmlns:cx2="http://schemas.microsoft.com/office/drawing/2015/10/21/chartex" xmlns:cx3="http://schemas.microsoft.com/office/drawing/2016/5/9/chartex" xmlns:cx4="http://schemas.microsoft.com/office/drawing/2016/5/10/chartex" xmlns:cx5="http://schemas.microsoft.com/office/drawing/2016/5/11/chartex" xmlns:cx6="http://schemas.microsoft.com/office/drawing/2016/5/12/chartex" xmlns:cx7="http://schemas.microsoft.com/office/drawing/2016/5/13/chartex" xmlns:cx8="http://schemas.microsoft.com/office/drawing/2016/5/14/chartex" xmlns:mc="http://schemas.openxmlformats.org/markup-compatibility/2006" xmlns:aink="http://schemas.microsoft.com/office/drawing/2016/ink" xmlns:am3d="http://schemas.microsoft.com/office/drawing/2017/model3d" xmlns:o="urn:schemas-microsoft-com:office:office" xmlns:r="http://schemas.openxmlformats.org/officeDocument/2006/relationships" xmlns:m="http://schemas.openxmlformats.org/officeDocument/2006/math" xmlns:v="urn:schemas-microsoft-com:vml" xmlns:wp14="http://schemas.microsoft.com/office/word/2010/wordprocessingDrawing" xmlns:wp="http://schemas.openxmlformats.org/drawingml/2006/wordprocessingDrawing" xmlns:w10="urn:schemas-microsoft-com:office:word" xmlns:w="http://schemas.openxmlformats.org/wordprocessingml/2006/main" xmlns:w14="http://schemas.microsoft.com/office/word/2010/wordml" xmlns:w15="http://schemas.microsoft.com/office/word/2012/wordml" xmlns:w16cex="http://schemas.microsoft.com/office/word/2018/wordml/cex" xmlns:w16cid="http://schemas.microsoft.com/office/word/2016/wordml/cid" xmlns:w16="http://schemas.microsoft.com/office/word/2018/wordml" xmlns:w16sdtdh="http://schemas.microsoft.com/office/word/2020/wordml/sdtdatahash" xmlns:w16se="http://schemas.microsoft.com/office/word/2015/wordml/symex" xmlns:wpg="http://schemas.microsoft.com/office/word/2010/wordprocessingGroup" xmlns:wpi="http://schemas.microsoft.com/office/word/2010/wordprocessingInk" xmlns:wne="http://schemas.microsoft.com/office/word/2006/wordml" xmlns:wps="http://schemas.microsoft.com/office/word/2010/wordprocessingShape" mc:Ignorable="w14 w15 w16se w16cid w16 w16cex w16sdtdh wp14">
   <w:p>
     <w:pPr>
       <w:jc w:val="right"/>
@@ -26491,7 +26483,7 @@
 </file>
 
 <file path=word/numbering.xml><?xml version="1.0" encoding="utf-8"?>
-<w:numbering xmlns:wpc="http://schemas.microsoft.com/office/word/2010/wordprocessingCanvas" xmlns:cx="http://schemas.microsoft.com/office/drawing/2014/chartex" xmlns:cx1="http://schemas.microsoft.com/office/drawing/2015/9/8/chartex" xmlns:cx2="http://schemas.microsoft.com/office/drawing/2015/10/21/chartex" xmlns:cx3="http://schemas.microsoft.com/office/drawing/2016/5/9/chartex" xmlns:cx4="http://schemas.microsoft.com/office/drawing/2016/5/10/chartex" xmlns:cx5="http://schemas.microsoft.com/office/drawing/2016/5/11/chartex" xmlns:cx6="http://schemas.microsoft.com/office/drawing/2016/5/12/chartex" xmlns:cx7="http://schemas.microsoft.com/office/drawing/2016/5/13/chartex" xmlns:cx8="http://schemas.microsoft.com/office/drawing/2016/5/14/chartex" xmlns:mc="http://schemas.openxmlformats.org/markup-compatibility/2006" xmlns:aink="http://schemas.microsoft.com/office/drawing/2016/ink" xmlns:am3d="http://schemas.microsoft.com/office/drawing/2017/model3d" xmlns:o="urn:schemas-microsoft-com:office:office" xmlns:oel="http://schemas.microsoft.com/office/2019/extlst" xmlns:r="http://schemas.openxmlformats.org/officeDocument/2006/relationships" xmlns:m="http://schemas.openxmlformats.org/officeDocument/2006/math" xmlns:v="urn:schemas-microsoft-com:vml" xmlns:wp14="http://schemas.microsoft.com/office/word/2010/wordprocessingDrawing" xmlns:wp="http://schemas.openxmlformats.org/drawingml/2006/wordprocessingDrawing" xmlns:w10="urn:schemas-microsoft-com:office:word" xmlns:w="http://schemas.openxmlformats.org/wordprocessingml/2006/main" xmlns:w14="http://schemas.microsoft.com/office/word/2010/wordml" xmlns:w15="http://schemas.microsoft.com/office/word/2012/wordml" xmlns:w16cex="http://schemas.microsoft.com/office/word/2018/wordml/cex" xmlns:w16cid="http://schemas.microsoft.com/office/word/2016/wordml/cid" xmlns:w16="http://schemas.microsoft.com/office/word/2018/wordml" xmlns:w16du="http://schemas.microsoft.com/office/word/2023/wordml/word16du" xmlns:w16sdtdh="http://schemas.microsoft.com/office/word/2020/wordml/sdtdatahash" xmlns:w16sdtfl="http://schemas.microsoft.com/office/word/2024/wordml/sdtformatlock" xmlns:w16se="http://schemas.microsoft.com/office/word/2015/wordml/symex" xmlns:wpg="http://schemas.microsoft.com/office/word/2010/wordprocessingGroup" xmlns:wpi="http://schemas.microsoft.com/office/word/2010/wordprocessingInk" xmlns:wne="http://schemas.microsoft.com/office/word/2006/wordml" xmlns:wps="http://schemas.microsoft.com/office/word/2010/wordprocessingShape" mc:Ignorable="w14 w15 w16se w16cid w16 w16cex w16sdtdh w16sdtfl w16du wp14">
+<w:numbering xmlns:wpc="http://schemas.microsoft.com/office/word/2010/wordprocessingCanvas" xmlns:cx="http://schemas.microsoft.com/office/drawing/2014/chartex" xmlns:cx1="http://schemas.microsoft.com/office/drawing/2015/9/8/chartex" xmlns:cx2="http://schemas.microsoft.com/office/drawing/2015/10/21/chartex" xmlns:cx3="http://schemas.microsoft.com/office/drawing/2016/5/9/chartex" xmlns:cx4="http://schemas.microsoft.com/office/drawing/2016/5/10/chartex" xmlns:cx5="http://schemas.microsoft.com/office/drawing/2016/5/11/chartex" xmlns:cx6="http://schemas.microsoft.com/office/drawing/2016/5/12/chartex" xmlns:cx7="http://schemas.microsoft.com/office/drawing/2016/5/13/chartex" xmlns:cx8="http://schemas.microsoft.com/office/drawing/2016/5/14/chartex" xmlns:mc="http://schemas.openxmlformats.org/markup-compatibility/2006" xmlns:aink="http://schemas.microsoft.com/office/drawing/2016/ink" xmlns:am3d="http://schemas.microsoft.com/office/drawing/2017/model3d" xmlns:o="urn:schemas-microsoft-com:office:office" xmlns:r="http://schemas.openxmlformats.org/officeDocument/2006/relationships" xmlns:m="http://schemas.openxmlformats.org/officeDocument/2006/math" xmlns:v="urn:schemas-microsoft-com:vml" xmlns:wp14="http://schemas.microsoft.com/office/word/2010/wordprocessingDrawing" xmlns:wp="http://schemas.openxmlformats.org/drawingml/2006/wordprocessingDrawing" xmlns:w10="urn:schemas-microsoft-com:office:word" xmlns:w="http://schemas.openxmlformats.org/wordprocessingml/2006/main" xmlns:w14="http://schemas.microsoft.com/office/word/2010/wordml" xmlns:w15="http://schemas.microsoft.com/office/word/2012/wordml" xmlns:w16cex="http://schemas.microsoft.com/office/word/2018/wordml/cex" xmlns:w16cid="http://schemas.microsoft.com/office/word/2016/wordml/cid" xmlns:w16="http://schemas.microsoft.com/office/word/2018/wordml" xmlns:w16sdtdh="http://schemas.microsoft.com/office/word/2020/wordml/sdtdatahash" xmlns:w16se="http://schemas.microsoft.com/office/word/2015/wordml/symex" xmlns:wpg="http://schemas.microsoft.com/office/word/2010/wordprocessingGroup" xmlns:wpi="http://schemas.microsoft.com/office/word/2010/wordprocessingInk" xmlns:wne="http://schemas.microsoft.com/office/word/2006/wordml" xmlns:wps="http://schemas.microsoft.com/office/word/2010/wordprocessingShape" mc:Ignorable="w14 w15 w16se w16cid w16 w16cex w16sdtdh wp14">
   <w:abstractNum w:abstractNumId="0" w15:restartNumberingAfterBreak="0">
     <w:nsid w:val="199A5CE6"/>
     <w:multiLevelType w:val="hybridMultilevel"/>
@@ -26745,26 +26737,26 @@
       </w:pPr>
     </w:lvl>
   </w:abstractNum>
-  <w:num w:numId="1" w16cid:durableId="1600870359">
+  <w:num w:numId="1">
     <w:abstractNumId w:val="1"/>
     <w:lvlOverride w:ilvl="0">
       <w:startOverride w:val="1"/>
     </w:lvlOverride>
   </w:num>
-  <w:num w:numId="2" w16cid:durableId="589049093">
+  <w:num w:numId="2">
     <w:abstractNumId w:val="0"/>
     <w:lvlOverride w:ilvl="0">
       <w:startOverride w:val="1"/>
     </w:lvlOverride>
   </w:num>
-  <w:num w:numId="3" w16cid:durableId="1514569095">
+  <w:num w:numId="3">
     <w:abstractNumId w:val="2"/>
   </w:num>
 </w:numbering>
 </file>
 
 <file path=word/styles.xml><?xml version="1.0" encoding="utf-8"?>
-<w:styles xmlns:mc="http://schemas.openxmlformats.org/markup-compatibility/2006" xmlns:r="http://schemas.openxmlformats.org/officeDocument/2006/relationships" xmlns:w="http://schemas.openxmlformats.org/wordprocessingml/2006/main" xmlns:w14="http://schemas.microsoft.com/office/word/2010/wordml" xmlns:w15="http://schemas.microsoft.com/office/word/2012/wordml" xmlns:w16cex="http://schemas.microsoft.com/office/word/2018/wordml/cex" xmlns:w16cid="http://schemas.microsoft.com/office/word/2016/wordml/cid" xmlns:w16="http://schemas.microsoft.com/office/word/2018/wordml" xmlns:w16du="http://schemas.microsoft.com/office/word/2023/wordml/word16du" xmlns:w16sdtdh="http://schemas.microsoft.com/office/word/2020/wordml/sdtdatahash" xmlns:w16sdtfl="http://schemas.microsoft.com/office/word/2024/wordml/sdtformatlock" xmlns:w16se="http://schemas.microsoft.com/office/word/2015/wordml/symex" mc:Ignorable="w14 w15 w16se w16cid w16 w16cex w16sdtdh w16sdtfl w16du">
+<w:styles xmlns:mc="http://schemas.openxmlformats.org/markup-compatibility/2006" xmlns:r="http://schemas.openxmlformats.org/officeDocument/2006/relationships" xmlns:w="http://schemas.openxmlformats.org/wordprocessingml/2006/main" xmlns:w14="http://schemas.microsoft.com/office/word/2010/wordml" xmlns:w15="http://schemas.microsoft.com/office/word/2012/wordml" xmlns:w16cex="http://schemas.microsoft.com/office/word/2018/wordml/cex" xmlns:w16cid="http://schemas.microsoft.com/office/word/2016/wordml/cid" xmlns:w16="http://schemas.microsoft.com/office/word/2018/wordml" xmlns:w16sdtdh="http://schemas.microsoft.com/office/word/2020/wordml/sdtdatahash" xmlns:w16se="http://schemas.microsoft.com/office/word/2015/wordml/symex" mc:Ignorable="w14 w15 w16se w16cid w16 w16cex w16sdtdh">
   <w:docDefaults>
     <w:rPrDefault>
       <w:rPr>
@@ -27248,7 +27240,6 @@
   <w:style w:type="character" w:default="1" w:styleId="DefaultParagraphFont">
     <w:name w:val="Default Paragraph Font"/>
     <w:uiPriority w:val="1"/>
-    <w:semiHidden/>
     <w:unhideWhenUsed/>
   </w:style>
   <w:style w:type="table" w:default="1" w:styleId="TableNormal">

</xml_diff>